<commit_message>
Add auto deploy workflow
</commit_message>
<xml_diff>
--- a/backend/services/templates_cv/cv_template.docx
+++ b/backend/services/templates_cv/cv_template.docx
@@ -3087,6 +3087,42 @@
                 <w:szCs w:val="20"/>
               </w:rPr>
               <w:t xml:space="preserve">}  </w:t>
+            </w:r>
+          </w:p>
+          <w:p>
+            <w:pPr>
+              <w:rPr>
+                <w:rFonts w:ascii="Saira" w:hAnsi="Saira"/>
+                <w:b/>
+                <w:bCs/>
+                <w:color w:val="4F6228" w:themeColor="accent3" w:themeShade="80"/>
+                <w:sz w:val="22"/>
+                <w:szCs w:val="22"/>
+              </w:rPr>
+            </w:pPr>
+            <w:proofErr w:type="gramStart"/>
+            <w:r>
+              <w:rPr>
+                <w:rFonts w:ascii="Saira" w:hAnsi="Saira"/>
+                <w:b/>
+                <w:bCs/>
+                <w:color w:val="4F6228" w:themeColor="accent3" w:themeShade="80"/>
+                <w:sz w:val="22"/>
+                <w:szCs w:val="22"/>
+              </w:rPr>
+              <w:t>{{ proj.url</w:t>
+            </w:r>
+            <w:proofErr w:type="gramEnd"/>
+            <w:r>
+              <w:rPr>
+                <w:rFonts w:ascii="Saira" w:hAnsi="Saira"/>
+                <w:b/>
+                <w:bCs/>
+                <w:color w:val="4F6228" w:themeColor="accent3" w:themeShade="80"/>
+                <w:sz w:val="22"/>
+                <w:szCs w:val="22"/>
+              </w:rPr>
+              <w:t xml:space="preserve"> }}</w:t>
             </w:r>
           </w:p>
           <w:p>
@@ -7301,7 +7337,6 @@
   <w:style w:type="character" w:default="1" w:styleId="DefaultParagraphFont">
     <w:name w:val="Default Paragraph Font"/>
     <w:uiPriority w:val="1"/>
-    <w:semiHidden/>
     <w:unhideWhenUsed/>
   </w:style>
   <w:style w:type="table" w:default="1" w:styleId="TableNormal">

</xml_diff>

<commit_message>
remove venv from tracking
</commit_message>
<xml_diff>
--- a/backend/services/templates_cv/cv_template.docx
+++ b/backend/services/templates_cv/cv_template.docx
@@ -23,15 +23,6 @@
         <w:gridCol w:w="10466"/>
       </w:tblGrid>
       <w:tr>
-        <w:tblPrEx>
-          <w:tblCellMar>
-            <w:top w:w="0" w:type="dxa"/>
-            <w:bottom w:w="0" w:type="dxa"/>
-          </w:tblCellMar>
-        </w:tblPrEx>
-        <w:trPr>
-          <w:trHeight w:val="1789"/>
-        </w:trPr>
         <w:tc>
           <w:tcPr>
             <w:tcW w:w="10466" w:type="dxa"/>
@@ -53,10 +44,6 @@
             <w:pPr>
               <w:spacing w:after="60"/>
               <w:jc w:val="center"/>
-              <w:rPr>
-                <w:b/>
-                <w:bCs/>
-              </w:rPr>
             </w:pPr>
             <w:proofErr w:type="gramStart"/>
             <w:r>
@@ -111,22 +98,16 @@
             <w:pPr>
               <w:spacing w:after="160"/>
               <w:jc w:val="center"/>
-              <w:rPr>
-                <w:b/>
-                <w:bCs/>
-                <w:sz w:val="32"/>
-                <w:szCs w:val="32"/>
-              </w:rPr>
             </w:pPr>
             <w:proofErr w:type="gramStart"/>
             <w:r>
               <w:rPr>
                 <w:rFonts w:ascii="Calibri" w:eastAsia="Calibri" w:hAnsi="Calibri" w:cs="Calibri"/>
-                <w:b/>
-                <w:bCs/>
+                <w:i/>
+                <w:iCs/>
                 <w:color w:val="A8CC80"/>
-                <w:sz w:val="40"/>
-                <w:szCs w:val="40"/>
+                <w:sz w:val="26"/>
+                <w:szCs w:val="26"/>
               </w:rPr>
               <w:t>{{ JOB</w:t>
             </w:r>
@@ -134,11 +115,11 @@
             <w:r>
               <w:rPr>
                 <w:rFonts w:ascii="Calibri" w:eastAsia="Calibri" w:hAnsi="Calibri" w:cs="Calibri"/>
-                <w:b/>
-                <w:bCs/>
+                <w:i/>
+                <w:iCs/>
                 <w:color w:val="A8CC80"/>
-                <w:sz w:val="40"/>
-                <w:szCs w:val="40"/>
+                <w:sz w:val="26"/>
+                <w:szCs w:val="26"/>
               </w:rPr>
               <w:t>_</w:t>
             </w:r>
@@ -146,11 +127,11 @@
             <w:r>
               <w:rPr>
                 <w:rFonts w:ascii="Calibri" w:eastAsia="Calibri" w:hAnsi="Calibri" w:cs="Calibri"/>
-                <w:b/>
-                <w:bCs/>
+                <w:i/>
+                <w:iCs/>
                 <w:color w:val="A8CC80"/>
-                <w:sz w:val="40"/>
-                <w:szCs w:val="40"/>
+                <w:sz w:val="26"/>
+                <w:szCs w:val="26"/>
               </w:rPr>
               <w:t>TITLE }</w:t>
             </w:r>
@@ -158,11 +139,11 @@
             <w:r>
               <w:rPr>
                 <w:rFonts w:ascii="Calibri" w:eastAsia="Calibri" w:hAnsi="Calibri" w:cs="Calibri"/>
-                <w:b/>
-                <w:bCs/>
+                <w:i/>
+                <w:iCs/>
                 <w:color w:val="A8CC80"/>
-                <w:sz w:val="40"/>
-                <w:szCs w:val="40"/>
+                <w:sz w:val="26"/>
+                <w:szCs w:val="26"/>
               </w:rPr>
               <w:t>}</w:t>
             </w:r>
@@ -175,11 +156,7 @@
             <w:r>
               <w:rPr>
                 <w:rFonts w:ascii="Calibri" w:eastAsia="Calibri" w:hAnsi="Calibri" w:cs="Calibri"/>
-                <w:b/>
-                <w:bCs/>
                 <w:color w:val="D0E8B0"/>
-                <w:sz w:val="28"/>
-                <w:szCs w:val="28"/>
               </w:rPr>
               <w:t>{{ CITY</w:t>
             </w:r>
@@ -187,11 +164,7 @@
             <w:r>
               <w:rPr>
                 <w:rFonts w:ascii="Calibri" w:eastAsia="Calibri" w:hAnsi="Calibri" w:cs="Calibri"/>
-                <w:b/>
-                <w:bCs/>
                 <w:color w:val="D0E8B0"/>
-                <w:sz w:val="28"/>
-                <w:szCs w:val="28"/>
               </w:rPr>
               <w:t xml:space="preserve"> </w:t>
             </w:r>
@@ -199,22 +172,14 @@
             <w:r>
               <w:rPr>
                 <w:rFonts w:ascii="Calibri" w:eastAsia="Calibri" w:hAnsi="Calibri" w:cs="Calibri"/>
-                <w:b/>
-                <w:bCs/>
                 <w:color w:val="D0E8B0"/>
-                <w:sz w:val="28"/>
-                <w:szCs w:val="28"/>
               </w:rPr>
               <w:t>}}</w:t>
             </w:r>
             <w:r>
               <w:rPr>
                 <w:rFonts w:ascii="Calibri" w:eastAsia="Calibri" w:hAnsi="Calibri" w:cs="Calibri"/>
-                <w:b/>
-                <w:bCs/>
                 <w:color w:val="6A9A50"/>
-                <w:sz w:val="28"/>
-                <w:szCs w:val="28"/>
               </w:rPr>
               <w:t xml:space="preserve">   </w:t>
             </w:r>
@@ -222,11 +187,7 @@
             <w:r>
               <w:rPr>
                 <w:rFonts w:ascii="Calibri" w:eastAsia="Calibri" w:hAnsi="Calibri" w:cs="Calibri"/>
-                <w:b/>
-                <w:bCs/>
                 <w:color w:val="6A9A50"/>
-                <w:sz w:val="28"/>
-                <w:szCs w:val="28"/>
               </w:rPr>
               <w:t>|</w:t>
             </w:r>
@@ -234,22 +195,14 @@
             <w:r>
               <w:rPr>
                 <w:rFonts w:ascii="Calibri" w:eastAsia="Calibri" w:hAnsi="Calibri" w:cs="Calibri"/>
-                <w:b/>
-                <w:bCs/>
                 <w:color w:val="6A9A50"/>
-                <w:sz w:val="28"/>
-                <w:szCs w:val="28"/>
               </w:rPr>
               <w:t xml:space="preserve">   </w:t>
             </w:r>
             <w:r>
               <w:rPr>
                 <w:rFonts w:ascii="Calibri" w:eastAsia="Calibri" w:hAnsi="Calibri" w:cs="Calibri"/>
-                <w:b/>
-                <w:bCs/>
                 <w:color w:val="D0E8B0"/>
-                <w:sz w:val="28"/>
-                <w:szCs w:val="28"/>
               </w:rPr>
               <w:t>{{ PHONE</w:t>
             </w:r>
@@ -257,11 +210,7 @@
             <w:r>
               <w:rPr>
                 <w:rFonts w:ascii="Calibri" w:eastAsia="Calibri" w:hAnsi="Calibri" w:cs="Calibri"/>
-                <w:b/>
-                <w:bCs/>
                 <w:color w:val="D0E8B0"/>
-                <w:sz w:val="28"/>
-                <w:szCs w:val="28"/>
               </w:rPr>
               <w:t xml:space="preserve"> </w:t>
             </w:r>
@@ -269,22 +218,14 @@
             <w:r>
               <w:rPr>
                 <w:rFonts w:ascii="Calibri" w:eastAsia="Calibri" w:hAnsi="Calibri" w:cs="Calibri"/>
-                <w:b/>
-                <w:bCs/>
                 <w:color w:val="D0E8B0"/>
-                <w:sz w:val="28"/>
-                <w:szCs w:val="28"/>
               </w:rPr>
               <w:t>}}</w:t>
             </w:r>
             <w:r>
               <w:rPr>
                 <w:rFonts w:ascii="Calibri" w:eastAsia="Calibri" w:hAnsi="Calibri" w:cs="Calibri"/>
-                <w:b/>
-                <w:bCs/>
                 <w:color w:val="6A9A50"/>
-                <w:sz w:val="28"/>
-                <w:szCs w:val="28"/>
               </w:rPr>
               <w:t xml:space="preserve">   </w:t>
             </w:r>
@@ -292,11 +233,7 @@
             <w:r>
               <w:rPr>
                 <w:rFonts w:ascii="Calibri" w:eastAsia="Calibri" w:hAnsi="Calibri" w:cs="Calibri"/>
-                <w:b/>
-                <w:bCs/>
                 <w:color w:val="6A9A50"/>
-                <w:sz w:val="28"/>
-                <w:szCs w:val="28"/>
               </w:rPr>
               <w:t>|</w:t>
             </w:r>
@@ -304,22 +241,14 @@
             <w:r>
               <w:rPr>
                 <w:rFonts w:ascii="Calibri" w:eastAsia="Calibri" w:hAnsi="Calibri" w:cs="Calibri"/>
-                <w:b/>
-                <w:bCs/>
                 <w:color w:val="6A9A50"/>
-                <w:sz w:val="28"/>
-                <w:szCs w:val="28"/>
               </w:rPr>
               <w:t xml:space="preserve">   </w:t>
             </w:r>
             <w:r>
               <w:rPr>
                 <w:rFonts w:ascii="Calibri" w:eastAsia="Calibri" w:hAnsi="Calibri" w:cs="Calibri"/>
-                <w:b/>
-                <w:bCs/>
                 <w:color w:val="D0E8B0"/>
-                <w:sz w:val="28"/>
-                <w:szCs w:val="28"/>
               </w:rPr>
               <w:t>{{ EMAIL</w:t>
             </w:r>
@@ -327,11 +256,7 @@
             <w:r>
               <w:rPr>
                 <w:rFonts w:ascii="Calibri" w:eastAsia="Calibri" w:hAnsi="Calibri" w:cs="Calibri"/>
-                <w:b/>
-                <w:bCs/>
                 <w:color w:val="D0E8B0"/>
-                <w:sz w:val="28"/>
-                <w:szCs w:val="28"/>
               </w:rPr>
               <w:t xml:space="preserve"> }}</w:t>
             </w:r>
@@ -366,12 +291,6 @@
         <w:gridCol w:w="10286"/>
       </w:tblGrid>
       <w:tr>
-        <w:tblPrEx>
-          <w:tblCellMar>
-            <w:top w:w="0" w:type="dxa"/>
-            <w:bottom w:w="0" w:type="dxa"/>
-          </w:tblCellMar>
-        </w:tblPrEx>
         <w:tc>
           <w:tcPr>
             <w:tcW w:w="180" w:type="dxa"/>
@@ -389,14 +308,7 @@
               <w:right w:w="0" w:type="dxa"/>
             </w:tcMar>
           </w:tcPr>
-          <w:p>
-            <w:pPr>
-              <w:rPr>
-                <w:sz w:val="40"/>
-                <w:szCs w:val="40"/>
-              </w:rPr>
-            </w:pPr>
-          </w:p>
+          <w:p/>
         </w:tc>
         <w:tc>
           <w:tcPr>
@@ -416,12 +328,6 @@
             </w:tcMar>
           </w:tcPr>
           <w:p>
-            <w:pPr>
-              <w:rPr>
-                <w:sz w:val="40"/>
-                <w:szCs w:val="40"/>
-              </w:rPr>
-            </w:pPr>
             <w:r>
               <w:rPr>
                 <w:rFonts w:ascii="Calibri" w:eastAsia="Calibri" w:hAnsi="Calibri" w:cs="Calibri"/>
@@ -429,8 +335,8 @@
                 <w:bCs/>
                 <w:caps/>
                 <w:color w:val="2D5016"/>
-                <w:sz w:val="40"/>
-                <w:szCs w:val="40"/>
+                <w:sz w:val="22"/>
+                <w:szCs w:val="22"/>
               </w:rPr>
               <w:t>Professional Summary</w:t>
             </w:r>
@@ -441,27 +347,19 @@
     <w:p>
       <w:pPr>
         <w:spacing w:after="80"/>
-        <w:rPr>
-          <w:sz w:val="32"/>
-          <w:szCs w:val="32"/>
-        </w:rPr>
       </w:pPr>
     </w:p>
     <w:p>
       <w:pPr>
         <w:jc w:val="both"/>
-        <w:rPr>
-          <w:sz w:val="32"/>
-          <w:szCs w:val="32"/>
-        </w:rPr>
       </w:pPr>
       <w:proofErr w:type="gramStart"/>
       <w:r>
         <w:rPr>
           <w:rFonts w:ascii="Calibri" w:eastAsia="Calibri" w:hAnsi="Calibri" w:cs="Calibri"/>
           <w:color w:val="3C3C3C"/>
-          <w:sz w:val="32"/>
-          <w:szCs w:val="32"/>
+          <w:sz w:val="19"/>
+          <w:szCs w:val="19"/>
         </w:rPr>
         <w:t>{{ SUMMARY</w:t>
       </w:r>
@@ -470,24 +368,14 @@
         <w:rPr>
           <w:rFonts w:ascii="Calibri" w:eastAsia="Calibri" w:hAnsi="Calibri" w:cs="Calibri"/>
           <w:color w:val="3C3C3C"/>
-          <w:sz w:val="32"/>
-          <w:szCs w:val="32"/>
+          <w:sz w:val="19"/>
+          <w:szCs w:val="19"/>
         </w:rPr>
         <w:t xml:space="preserve"> }}</w:t>
       </w:r>
     </w:p>
     <w:p>
-      <w:pPr>
-        <w:rPr>
-          <w:sz w:val="32"/>
-          <w:szCs w:val="32"/>
-        </w:rPr>
-      </w:pPr>
-      <w:r>
-        <w:rPr>
-          <w:sz w:val="32"/>
-          <w:szCs w:val="32"/>
-        </w:rPr>
+      <w:r>
         <w:br/>
       </w:r>
     </w:p>
@@ -513,12 +401,6 @@
         <w:gridCol w:w="10286"/>
       </w:tblGrid>
       <w:tr>
-        <w:tblPrEx>
-          <w:tblCellMar>
-            <w:top w:w="0" w:type="dxa"/>
-            <w:bottom w:w="0" w:type="dxa"/>
-          </w:tblCellMar>
-        </w:tblPrEx>
         <w:tc>
           <w:tcPr>
             <w:tcW w:w="180" w:type="dxa"/>
@@ -536,14 +418,7 @@
               <w:right w:w="0" w:type="dxa"/>
             </w:tcMar>
           </w:tcPr>
-          <w:p>
-            <w:pPr>
-              <w:rPr>
-                <w:sz w:val="40"/>
-                <w:szCs w:val="40"/>
-              </w:rPr>
-            </w:pPr>
-          </w:p>
+          <w:p/>
         </w:tc>
         <w:tc>
           <w:tcPr>
@@ -563,12 +438,6 @@
             </w:tcMar>
           </w:tcPr>
           <w:p>
-            <w:pPr>
-              <w:rPr>
-                <w:sz w:val="40"/>
-                <w:szCs w:val="40"/>
-              </w:rPr>
-            </w:pPr>
             <w:r>
               <w:rPr>
                 <w:rFonts w:ascii="Calibri" w:eastAsia="Calibri" w:hAnsi="Calibri" w:cs="Calibri"/>
@@ -576,8 +445,8 @@
                 <w:bCs/>
                 <w:caps/>
                 <w:color w:val="2D5016"/>
-                <w:sz w:val="40"/>
-                <w:szCs w:val="40"/>
+                <w:sz w:val="22"/>
+                <w:szCs w:val="22"/>
               </w:rPr>
               <w:t>Skills</w:t>
             </w:r>
@@ -588,25 +457,15 @@
     <w:p>
       <w:pPr>
         <w:spacing w:after="80"/>
-        <w:rPr>
-          <w:sz w:val="32"/>
-          <w:szCs w:val="32"/>
-        </w:rPr>
       </w:pPr>
     </w:p>
     <w:p>
-      <w:pPr>
-        <w:rPr>
-          <w:sz w:val="28"/>
-          <w:szCs w:val="28"/>
-        </w:rPr>
-      </w:pPr>
-      <w:r>
-        <w:rPr>
-          <w:rFonts w:ascii="Calibri" w:eastAsia="Calibri" w:hAnsi="Calibri" w:cs="Calibri"/>
-          <w:color w:val="3C3C3C"/>
-          <w:sz w:val="28"/>
-          <w:szCs w:val="28"/>
+      <w:r>
+        <w:rPr>
+          <w:rFonts w:ascii="Calibri" w:eastAsia="Calibri" w:hAnsi="Calibri" w:cs="Calibri"/>
+          <w:color w:val="3C3C3C"/>
+          <w:sz w:val="18"/>
+          <w:szCs w:val="18"/>
         </w:rPr>
         <w:t>{% for cat in skills %}</w:t>
       </w:r>
@@ -617,10 +476,6 @@
           <w:bottom w:val="single" w:sz="4" w:space="0" w:color="C8D8B0"/>
         </w:pBdr>
         <w:spacing w:before="100" w:after="60"/>
-        <w:rPr>
-          <w:sz w:val="32"/>
-          <w:szCs w:val="32"/>
-        </w:rPr>
       </w:pPr>
       <w:proofErr w:type="gramStart"/>
       <w:r>
@@ -630,8 +485,6 @@
           <w:bCs/>
           <w:caps/>
           <w:color w:val="5A8A35"/>
-          <w:sz w:val="32"/>
-          <w:szCs w:val="32"/>
         </w:rPr>
         <w:t>{{ cat.category</w:t>
       </w:r>
@@ -643,15 +496,14 @@
           <w:bCs/>
           <w:caps/>
           <w:color w:val="5A8A35"/>
-          <w:sz w:val="32"/>
-          <w:szCs w:val="32"/>
         </w:rPr>
         <w:t xml:space="preserve"> }}</w:t>
       </w:r>
     </w:p>
     <w:tbl>
       <w:tblPr>
-        <w:tblW w:w="10066" w:type="dxa"/>
+        <w:tblW w:w="7797" w:type="dxa"/>
+        <w:jc w:val="center"/>
         <w:tblBorders>
           <w:top w:val="single" w:sz="4" w:space="0" w:color="auto"/>
           <w:left w:val="single" w:sz="4" w:space="0" w:color="auto"/>
@@ -667,20 +519,15 @@
         <w:tblLook w:val="0000" w:firstRow="0" w:lastRow="0" w:firstColumn="0" w:lastColumn="0" w:noHBand="0" w:noVBand="0"/>
       </w:tblPr>
       <w:tblGrid>
-        <w:gridCol w:w="4953"/>
-        <w:gridCol w:w="196"/>
-        <w:gridCol w:w="4917"/>
+        <w:gridCol w:w="7797"/>
       </w:tblGrid>
       <w:tr>
-        <w:tblPrEx>
-          <w:tblCellMar>
-            <w:top w:w="0" w:type="dxa"/>
-            <w:bottom w:w="0" w:type="dxa"/>
-          </w:tblCellMar>
-        </w:tblPrEx>
+        <w:trPr>
+          <w:jc w:val="center"/>
+        </w:trPr>
         <w:tc>
           <w:tcPr>
-            <w:tcW w:w="5033" w:type="dxa"/>
+            <w:tcW w:w="7797" w:type="dxa"/>
             <w:tcBorders>
               <w:top w:val="nil"/>
               <w:left w:val="nil"/>
@@ -689,18 +536,12 @@
             </w:tcBorders>
           </w:tcPr>
           <w:p>
-            <w:pPr>
-              <w:rPr>
-                <w:sz w:val="28"/>
-                <w:szCs w:val="28"/>
-              </w:rPr>
-            </w:pPr>
             <w:r>
               <w:rPr>
                 <w:rFonts w:ascii="Calibri" w:eastAsia="Calibri" w:hAnsi="Calibri" w:cs="Calibri"/>
                 <w:color w:val="3C3C3C"/>
-                <w:sz w:val="28"/>
-                <w:szCs w:val="28"/>
+                <w:sz w:val="18"/>
+                <w:szCs w:val="18"/>
               </w:rPr>
               <w:t xml:space="preserve">{% for s in </w:t>
             </w:r>
@@ -710,8 +551,8 @@
               <w:rPr>
                 <w:rFonts w:ascii="Calibri" w:eastAsia="Calibri" w:hAnsi="Calibri" w:cs="Calibri"/>
                 <w:color w:val="3C3C3C"/>
-                <w:sz w:val="28"/>
-                <w:szCs w:val="28"/>
+                <w:sz w:val="18"/>
+                <w:szCs w:val="18"/>
               </w:rPr>
               <w:t>cat.skills</w:t>
             </w:r>
@@ -720,8 +561,8 @@
               <w:rPr>
                 <w:rFonts w:ascii="Calibri" w:eastAsia="Calibri" w:hAnsi="Calibri" w:cs="Calibri"/>
                 <w:color w:val="3C3C3C"/>
-                <w:sz w:val="28"/>
-                <w:szCs w:val="28"/>
+                <w:sz w:val="18"/>
+                <w:szCs w:val="18"/>
               </w:rPr>
               <w:t>_list</w:t>
             </w:r>
@@ -730,8 +571,8 @@
               <w:rPr>
                 <w:rFonts w:ascii="Calibri" w:eastAsia="Calibri" w:hAnsi="Calibri" w:cs="Calibri"/>
                 <w:color w:val="3C3C3C"/>
-                <w:sz w:val="28"/>
-                <w:szCs w:val="28"/>
+                <w:sz w:val="18"/>
+                <w:szCs w:val="18"/>
               </w:rPr>
               <w:t xml:space="preserve"> %}</w:t>
             </w:r>
@@ -747,10 +588,6 @@
               <w:shd w:val="clear" w:color="auto" w:fill="FAFAF7"/>
               <w:spacing w:before="80" w:after="20"/>
               <w:ind w:left="140"/>
-              <w:rPr>
-                <w:sz w:val="32"/>
-                <w:szCs w:val="32"/>
-              </w:rPr>
             </w:pPr>
             <w:proofErr w:type="gramStart"/>
             <w:r>
@@ -759,8 +596,8 @@
                 <w:b/>
                 <w:bCs/>
                 <w:color w:val="2D5016"/>
-                <w:sz w:val="32"/>
-                <w:szCs w:val="32"/>
+                <w:sz w:val="19"/>
+                <w:szCs w:val="19"/>
               </w:rPr>
               <w:t xml:space="preserve">{{ </w:t>
             </w:r>
@@ -771,8 +608,8 @@
                 <w:b/>
                 <w:bCs/>
                 <w:color w:val="2D5016"/>
-                <w:sz w:val="32"/>
-                <w:szCs w:val="32"/>
+                <w:sz w:val="19"/>
+                <w:szCs w:val="19"/>
               </w:rPr>
               <w:t>s</w:t>
             </w:r>
@@ -783,8 +620,8 @@
                 <w:b/>
                 <w:bCs/>
                 <w:color w:val="2D5016"/>
-                <w:sz w:val="32"/>
-                <w:szCs w:val="32"/>
+                <w:sz w:val="19"/>
+                <w:szCs w:val="19"/>
               </w:rPr>
               <w:t>.</w:t>
             </w:r>
@@ -795,8 +632,8 @@
                 <w:b/>
                 <w:bCs/>
                 <w:color w:val="2D5016"/>
-                <w:sz w:val="32"/>
-                <w:szCs w:val="32"/>
+                <w:sz w:val="19"/>
+                <w:szCs w:val="19"/>
               </w:rPr>
               <w:t>skill</w:t>
             </w:r>
@@ -807,8 +644,8 @@
                 <w:b/>
                 <w:bCs/>
                 <w:color w:val="2D5016"/>
-                <w:sz w:val="32"/>
-                <w:szCs w:val="32"/>
+                <w:sz w:val="19"/>
+                <w:szCs w:val="19"/>
               </w:rPr>
               <w:t xml:space="preserve"> }</w:t>
             </w:r>
@@ -819,8 +656,8 @@
                 <w:b/>
                 <w:bCs/>
                 <w:color w:val="2D5016"/>
-                <w:sz w:val="32"/>
-                <w:szCs w:val="32"/>
+                <w:sz w:val="19"/>
+                <w:szCs w:val="19"/>
               </w:rPr>
               <w:t>}</w:t>
             </w:r>
@@ -833,21 +670,16 @@
                 <w:bottom w:val="single" w:sz="4" w:space="0" w:color="C8D8B0"/>
                 <w:right w:val="single" w:sz="4" w:space="0" w:color="C8D8B0"/>
               </w:pBdr>
-              <w:shd w:val="clear" w:color="auto" w:fill="FAFAF7"/>
               <w:spacing w:after="100"/>
               <w:ind w:left="140"/>
-              <w:rPr>
-                <w:sz w:val="28"/>
-                <w:szCs w:val="28"/>
-              </w:rPr>
             </w:pPr>
             <w:proofErr w:type="gramStart"/>
             <w:r>
               <w:rPr>
                 <w:rFonts w:ascii="Calibri" w:eastAsia="Calibri" w:hAnsi="Calibri" w:cs="Calibri"/>
                 <w:color w:val="7A7A6E"/>
-                <w:sz w:val="28"/>
-                <w:szCs w:val="28"/>
+                <w:sz w:val="17"/>
+                <w:szCs w:val="17"/>
               </w:rPr>
               <w:t xml:space="preserve">{{ </w:t>
             </w:r>
@@ -856,8 +688,8 @@
               <w:rPr>
                 <w:rFonts w:ascii="Calibri" w:eastAsia="Calibri" w:hAnsi="Calibri" w:cs="Calibri"/>
                 <w:color w:val="7A7A6E"/>
-                <w:sz w:val="28"/>
-                <w:szCs w:val="28"/>
+                <w:sz w:val="17"/>
+                <w:szCs w:val="17"/>
               </w:rPr>
               <w:t>s</w:t>
             </w:r>
@@ -866,8 +698,8 @@
               <w:rPr>
                 <w:rFonts w:ascii="Calibri" w:eastAsia="Calibri" w:hAnsi="Calibri" w:cs="Calibri"/>
                 <w:color w:val="7A7A6E"/>
-                <w:sz w:val="28"/>
-                <w:szCs w:val="28"/>
+                <w:sz w:val="17"/>
+                <w:szCs w:val="17"/>
               </w:rPr>
               <w:t>.</w:t>
             </w:r>
@@ -876,8 +708,8 @@
               <w:rPr>
                 <w:rFonts w:ascii="Calibri" w:eastAsia="Calibri" w:hAnsi="Calibri" w:cs="Calibri"/>
                 <w:color w:val="7A7A6E"/>
-                <w:sz w:val="28"/>
-                <w:szCs w:val="28"/>
+                <w:sz w:val="17"/>
+                <w:szCs w:val="17"/>
               </w:rPr>
               <w:t>description</w:t>
             </w:r>
@@ -886,8 +718,8 @@
               <w:rPr>
                 <w:rFonts w:ascii="Calibri" w:eastAsia="Calibri" w:hAnsi="Calibri" w:cs="Calibri"/>
                 <w:color w:val="7A7A6E"/>
-                <w:sz w:val="28"/>
-                <w:szCs w:val="28"/>
+                <w:sz w:val="17"/>
+                <w:szCs w:val="17"/>
               </w:rPr>
               <w:t xml:space="preserve"> }</w:t>
             </w:r>
@@ -896,25 +728,19 @@
               <w:rPr>
                 <w:rFonts w:ascii="Calibri" w:eastAsia="Calibri" w:hAnsi="Calibri" w:cs="Calibri"/>
                 <w:color w:val="7A7A6E"/>
-                <w:sz w:val="28"/>
-                <w:szCs w:val="28"/>
+                <w:sz w:val="17"/>
+                <w:szCs w:val="17"/>
               </w:rPr>
               <w:t>}</w:t>
             </w:r>
           </w:p>
           <w:p>
-            <w:pPr>
-              <w:rPr>
-                <w:sz w:val="28"/>
-                <w:szCs w:val="28"/>
-              </w:rPr>
-            </w:pPr>
             <w:r>
               <w:rPr>
                 <w:rFonts w:ascii="Calibri" w:eastAsia="Calibri" w:hAnsi="Calibri" w:cs="Calibri"/>
                 <w:color w:val="3C3C3C"/>
-                <w:sz w:val="28"/>
-                <w:szCs w:val="28"/>
+                <w:sz w:val="18"/>
+                <w:szCs w:val="18"/>
               </w:rPr>
               <w:t xml:space="preserve">{% </w:t>
             </w:r>
@@ -923,8 +749,8 @@
               <w:rPr>
                 <w:rFonts w:ascii="Calibri" w:eastAsia="Calibri" w:hAnsi="Calibri" w:cs="Calibri"/>
                 <w:color w:val="3C3C3C"/>
-                <w:sz w:val="28"/>
-                <w:szCs w:val="28"/>
+                <w:sz w:val="18"/>
+                <w:szCs w:val="18"/>
               </w:rPr>
               <w:t>endfor</w:t>
             </w:r>
@@ -933,66 +759,22 @@
               <w:rPr>
                 <w:rFonts w:ascii="Calibri" w:eastAsia="Calibri" w:hAnsi="Calibri" w:cs="Calibri"/>
                 <w:color w:val="3C3C3C"/>
-                <w:sz w:val="28"/>
-                <w:szCs w:val="28"/>
+                <w:sz w:val="18"/>
+                <w:szCs w:val="18"/>
               </w:rPr>
               <w:t xml:space="preserve"> %}</w:t>
             </w:r>
-          </w:p>
-        </w:tc>
-        <w:tc>
-          <w:tcPr>
-            <w:tcW w:w="200" w:type="dxa"/>
-            <w:tcBorders>
-              <w:top w:val="nil"/>
-              <w:left w:val="nil"/>
-              <w:bottom w:val="nil"/>
-              <w:right w:val="nil"/>
-            </w:tcBorders>
-          </w:tcPr>
-          <w:p>
-            <w:pPr>
-              <w:rPr>
-                <w:sz w:val="28"/>
-                <w:szCs w:val="28"/>
-              </w:rPr>
-            </w:pPr>
-          </w:p>
-        </w:tc>
-        <w:tc>
-          <w:tcPr>
-            <w:tcW w:w="5033" w:type="dxa"/>
-            <w:tcBorders>
-              <w:top w:val="nil"/>
-              <w:left w:val="nil"/>
-              <w:bottom w:val="nil"/>
-              <w:right w:val="nil"/>
-            </w:tcBorders>
-          </w:tcPr>
-          <w:p>
-            <w:pPr>
-              <w:rPr>
-                <w:sz w:val="28"/>
-                <w:szCs w:val="28"/>
-              </w:rPr>
-            </w:pPr>
           </w:p>
         </w:tc>
       </w:tr>
     </w:tbl>
     <w:p>
-      <w:pPr>
-        <w:rPr>
-          <w:sz w:val="28"/>
-          <w:szCs w:val="28"/>
-        </w:rPr>
-      </w:pPr>
-      <w:r>
-        <w:rPr>
-          <w:rFonts w:ascii="Calibri" w:eastAsia="Calibri" w:hAnsi="Calibri" w:cs="Calibri"/>
-          <w:color w:val="3C3C3C"/>
-          <w:sz w:val="28"/>
-          <w:szCs w:val="28"/>
+      <w:r>
+        <w:rPr>
+          <w:rFonts w:ascii="Calibri" w:eastAsia="Calibri" w:hAnsi="Calibri" w:cs="Calibri"/>
+          <w:color w:val="3C3C3C"/>
+          <w:sz w:val="18"/>
+          <w:szCs w:val="18"/>
         </w:rPr>
         <w:t xml:space="preserve">{% </w:t>
       </w:r>
@@ -1001,8 +783,8 @@
         <w:rPr>
           <w:rFonts w:ascii="Calibri" w:eastAsia="Calibri" w:hAnsi="Calibri" w:cs="Calibri"/>
           <w:color w:val="3C3C3C"/>
-          <w:sz w:val="28"/>
-          <w:szCs w:val="28"/>
+          <w:sz w:val="18"/>
+          <w:szCs w:val="18"/>
         </w:rPr>
         <w:t>endfor</w:t>
       </w:r>
@@ -1011,42 +793,21 @@
         <w:rPr>
           <w:rFonts w:ascii="Calibri" w:eastAsia="Calibri" w:hAnsi="Calibri" w:cs="Calibri"/>
           <w:color w:val="3C3C3C"/>
-          <w:sz w:val="28"/>
-          <w:szCs w:val="28"/>
+          <w:sz w:val="18"/>
+          <w:szCs w:val="18"/>
         </w:rPr>
         <w:t xml:space="preserve"> %}</w:t>
       </w:r>
     </w:p>
     <w:p>
-      <w:pPr>
-        <w:rPr>
-          <w:sz w:val="32"/>
-          <w:szCs w:val="32"/>
-        </w:rPr>
-        <w:sectPr>
-          <w:pgSz w:w="11906" w:h="16838"/>
-          <w:pgMar w:top="0" w:right="720" w:bottom="720" w:left="720" w:header="708" w:footer="708" w:gutter="0"/>
-          <w:cols w:space="720"/>
-          <w:docGrid w:linePitch="360"/>
-        </w:sectPr>
-      </w:pPr>
-    </w:p>
-    <w:p>
-      <w:pPr>
-        <w:rPr>
-          <w:sz w:val="32"/>
-          <w:szCs w:val="32"/>
-        </w:rPr>
-      </w:pPr>
-      <w:r>
-        <w:rPr>
-          <w:sz w:val="32"/>
-          <w:szCs w:val="32"/>
-        </w:rPr>
-        <w:lastRenderedPageBreak/>
+      <w:r>
         <w:br/>
       </w:r>
-    </w:p>
+      <w:r>
+        <w:br w:type="page"/>
+      </w:r>
+    </w:p>
+    <w:p/>
     <w:tbl>
       <w:tblPr>
         <w:tblW w:w="10466" w:type="dxa"/>
@@ -1069,12 +830,6 @@
         <w:gridCol w:w="10286"/>
       </w:tblGrid>
       <w:tr>
-        <w:tblPrEx>
-          <w:tblCellMar>
-            <w:top w:w="0" w:type="dxa"/>
-            <w:bottom w:w="0" w:type="dxa"/>
-          </w:tblCellMar>
-        </w:tblPrEx>
         <w:tc>
           <w:tcPr>
             <w:tcW w:w="180" w:type="dxa"/>
@@ -1092,14 +847,7 @@
               <w:right w:w="0" w:type="dxa"/>
             </w:tcMar>
           </w:tcPr>
-          <w:p>
-            <w:pPr>
-              <w:rPr>
-                <w:sz w:val="40"/>
-                <w:szCs w:val="40"/>
-              </w:rPr>
-            </w:pPr>
-          </w:p>
+          <w:p/>
         </w:tc>
         <w:tc>
           <w:tcPr>
@@ -1119,12 +867,6 @@
             </w:tcMar>
           </w:tcPr>
           <w:p>
-            <w:pPr>
-              <w:rPr>
-                <w:sz w:val="40"/>
-                <w:szCs w:val="40"/>
-              </w:rPr>
-            </w:pPr>
             <w:r>
               <w:rPr>
                 <w:rFonts w:ascii="Calibri" w:eastAsia="Calibri" w:hAnsi="Calibri" w:cs="Calibri"/>
@@ -1132,8 +874,8 @@
                 <w:bCs/>
                 <w:caps/>
                 <w:color w:val="2D5016"/>
-                <w:sz w:val="40"/>
-                <w:szCs w:val="40"/>
+                <w:sz w:val="22"/>
+                <w:szCs w:val="22"/>
               </w:rPr>
               <w:t>Experience</w:t>
             </w:r>
@@ -1144,25 +886,15 @@
     <w:p>
       <w:pPr>
         <w:spacing w:after="80"/>
-        <w:rPr>
-          <w:sz w:val="40"/>
-          <w:szCs w:val="40"/>
-        </w:rPr>
       </w:pPr>
     </w:p>
     <w:p>
-      <w:pPr>
-        <w:rPr>
-          <w:sz w:val="28"/>
-          <w:szCs w:val="28"/>
-        </w:rPr>
-      </w:pPr>
-      <w:r>
-        <w:rPr>
-          <w:rFonts w:ascii="Calibri" w:eastAsia="Calibri" w:hAnsi="Calibri" w:cs="Calibri"/>
-          <w:color w:val="3C3C3C"/>
-          <w:sz w:val="28"/>
-          <w:szCs w:val="28"/>
+      <w:r>
+        <w:rPr>
+          <w:rFonts w:ascii="Calibri" w:eastAsia="Calibri" w:hAnsi="Calibri" w:cs="Calibri"/>
+          <w:color w:val="3C3C3C"/>
+          <w:sz w:val="18"/>
+          <w:szCs w:val="18"/>
         </w:rPr>
         <w:t>{% for exp in experience %}</w:t>
       </w:r>
@@ -1185,19 +917,13 @@
         <w:tblLook w:val="0000" w:firstRow="0" w:lastRow="0" w:firstColumn="0" w:lastColumn="0" w:noHBand="0" w:noVBand="0"/>
       </w:tblPr>
       <w:tblGrid>
-        <w:gridCol w:w="6663"/>
-        <w:gridCol w:w="3403"/>
+        <w:gridCol w:w="6039"/>
+        <w:gridCol w:w="4027"/>
       </w:tblGrid>
       <w:tr>
-        <w:tblPrEx>
-          <w:tblCellMar>
-            <w:top w:w="0" w:type="dxa"/>
-            <w:bottom w:w="0" w:type="dxa"/>
-          </w:tblCellMar>
-        </w:tblPrEx>
         <w:tc>
           <w:tcPr>
-            <w:tcW w:w="6663" w:type="dxa"/>
+            <w:tcW w:w="6039" w:type="dxa"/>
             <w:tcBorders>
               <w:top w:val="nil"/>
               <w:left w:val="nil"/>
@@ -1212,12 +938,6 @@
             </w:tcMar>
           </w:tcPr>
           <w:p>
-            <w:pPr>
-              <w:rPr>
-                <w:sz w:val="28"/>
-                <w:szCs w:val="28"/>
-              </w:rPr>
-            </w:pPr>
             <w:proofErr w:type="gramStart"/>
             <w:r>
               <w:rPr>
@@ -1225,8 +945,8 @@
                 <w:b/>
                 <w:bCs/>
                 <w:color w:val="1A1A1A"/>
-                <w:sz w:val="32"/>
-                <w:szCs w:val="32"/>
+                <w:sz w:val="22"/>
+                <w:szCs w:val="22"/>
               </w:rPr>
               <w:t xml:space="preserve">{{ </w:t>
             </w:r>
@@ -1237,8 +957,8 @@
                 <w:b/>
                 <w:bCs/>
                 <w:color w:val="1A1A1A"/>
-                <w:sz w:val="32"/>
-                <w:szCs w:val="32"/>
+                <w:sz w:val="22"/>
+                <w:szCs w:val="22"/>
               </w:rPr>
               <w:t>exp</w:t>
             </w:r>
@@ -1249,8 +969,8 @@
                 <w:b/>
                 <w:bCs/>
                 <w:color w:val="1A1A1A"/>
-                <w:sz w:val="32"/>
-                <w:szCs w:val="32"/>
+                <w:sz w:val="22"/>
+                <w:szCs w:val="22"/>
               </w:rPr>
               <w:t>.role</w:t>
             </w:r>
@@ -1261,8 +981,8 @@
                 <w:b/>
                 <w:bCs/>
                 <w:color w:val="1A1A1A"/>
-                <w:sz w:val="32"/>
-                <w:szCs w:val="32"/>
+                <w:sz w:val="22"/>
+                <w:szCs w:val="22"/>
               </w:rPr>
               <w:t xml:space="preserve"> }}</w:t>
             </w:r>
@@ -1270,7 +990,7 @@
         </w:tc>
         <w:tc>
           <w:tcPr>
-            <w:tcW w:w="3403" w:type="dxa"/>
+            <w:tcW w:w="4027" w:type="dxa"/>
             <w:tcBorders>
               <w:top w:val="nil"/>
               <w:left w:val="nil"/>
@@ -1287,10 +1007,6 @@
           <w:p>
             <w:pPr>
               <w:jc w:val="right"/>
-              <w:rPr>
-                <w:sz w:val="22"/>
-                <w:szCs w:val="22"/>
-              </w:rPr>
             </w:pPr>
             <w:proofErr w:type="gramStart"/>
             <w:r>
@@ -1299,8 +1015,8 @@
                 <w:i/>
                 <w:iCs/>
                 <w:color w:val="7A7A6E"/>
-                <w:sz w:val="22"/>
-                <w:szCs w:val="22"/>
+                <w:sz w:val="19"/>
+                <w:szCs w:val="19"/>
               </w:rPr>
               <w:t xml:space="preserve">{{ </w:t>
             </w:r>
@@ -1311,8 +1027,8 @@
                 <w:i/>
                 <w:iCs/>
                 <w:color w:val="7A7A6E"/>
-                <w:sz w:val="22"/>
-                <w:szCs w:val="22"/>
+                <w:sz w:val="19"/>
+                <w:szCs w:val="19"/>
               </w:rPr>
               <w:t>exp</w:t>
             </w:r>
@@ -1323,8 +1039,8 @@
                 <w:i/>
                 <w:iCs/>
                 <w:color w:val="7A7A6E"/>
-                <w:sz w:val="22"/>
-                <w:szCs w:val="22"/>
+                <w:sz w:val="19"/>
+                <w:szCs w:val="19"/>
               </w:rPr>
               <w:t>.</w:t>
             </w:r>
@@ -1335,8 +1051,8 @@
                 <w:i/>
                 <w:iCs/>
                 <w:color w:val="7A7A6E"/>
-                <w:sz w:val="22"/>
-                <w:szCs w:val="22"/>
+                <w:sz w:val="19"/>
+                <w:szCs w:val="19"/>
               </w:rPr>
               <w:t>startYear</w:t>
             </w:r>
@@ -1347,8 +1063,8 @@
                 <w:i/>
                 <w:iCs/>
                 <w:color w:val="7A7A6E"/>
-                <w:sz w:val="22"/>
-                <w:szCs w:val="22"/>
+                <w:sz w:val="19"/>
+                <w:szCs w:val="19"/>
               </w:rPr>
               <w:t xml:space="preserve"> }</w:t>
             </w:r>
@@ -1359,8 +1075,8 @@
                 <w:i/>
                 <w:iCs/>
                 <w:color w:val="7A7A6E"/>
-                <w:sz w:val="22"/>
-                <w:szCs w:val="22"/>
+                <w:sz w:val="19"/>
+                <w:szCs w:val="19"/>
               </w:rPr>
               <w:t xml:space="preserve">} – </w:t>
             </w:r>
@@ -1371,8 +1087,8 @@
                 <w:i/>
                 <w:iCs/>
                 <w:color w:val="7A7A6E"/>
-                <w:sz w:val="22"/>
-                <w:szCs w:val="22"/>
+                <w:sz w:val="19"/>
+                <w:szCs w:val="19"/>
               </w:rPr>
               <w:t xml:space="preserve">{{ </w:t>
             </w:r>
@@ -1383,8 +1099,8 @@
                 <w:i/>
                 <w:iCs/>
                 <w:color w:val="7A7A6E"/>
-                <w:sz w:val="22"/>
-                <w:szCs w:val="22"/>
+                <w:sz w:val="19"/>
+                <w:szCs w:val="19"/>
               </w:rPr>
               <w:t>exp</w:t>
             </w:r>
@@ -1395,8 +1111,8 @@
                 <w:i/>
                 <w:iCs/>
                 <w:color w:val="7A7A6E"/>
-                <w:sz w:val="22"/>
-                <w:szCs w:val="22"/>
+                <w:sz w:val="19"/>
+                <w:szCs w:val="19"/>
               </w:rPr>
               <w:t>.endYear</w:t>
             </w:r>
@@ -1407,8 +1123,8 @@
                 <w:i/>
                 <w:iCs/>
                 <w:color w:val="7A7A6E"/>
-                <w:sz w:val="22"/>
-                <w:szCs w:val="22"/>
+                <w:sz w:val="19"/>
+                <w:szCs w:val="19"/>
               </w:rPr>
               <w:t xml:space="preserve"> }}</w:t>
             </w:r>
@@ -1419,10 +1135,6 @@
     <w:p>
       <w:pPr>
         <w:spacing w:before="60" w:after="60"/>
-        <w:rPr>
-          <w:sz w:val="28"/>
-          <w:szCs w:val="28"/>
-        </w:rPr>
       </w:pPr>
       <w:proofErr w:type="gramStart"/>
       <w:r>
@@ -1431,8 +1143,8 @@
           <w:b/>
           <w:bCs/>
           <w:color w:val="4A7C2F"/>
-          <w:sz w:val="32"/>
-          <w:szCs w:val="32"/>
+          <w:sz w:val="19"/>
+          <w:szCs w:val="19"/>
         </w:rPr>
         <w:t xml:space="preserve">{{ </w:t>
       </w:r>
@@ -1443,8 +1155,8 @@
           <w:b/>
           <w:bCs/>
           <w:color w:val="4A7C2F"/>
-          <w:sz w:val="32"/>
-          <w:szCs w:val="32"/>
+          <w:sz w:val="19"/>
+          <w:szCs w:val="19"/>
         </w:rPr>
         <w:t>exp</w:t>
       </w:r>
@@ -1455,8 +1167,8 @@
           <w:b/>
           <w:bCs/>
           <w:color w:val="4A7C2F"/>
-          <w:sz w:val="32"/>
-          <w:szCs w:val="32"/>
+          <w:sz w:val="19"/>
+          <w:szCs w:val="19"/>
         </w:rPr>
         <w:t>.</w:t>
       </w:r>
@@ -1467,8 +1179,8 @@
           <w:b/>
           <w:bCs/>
           <w:color w:val="4A7C2F"/>
-          <w:sz w:val="32"/>
-          <w:szCs w:val="32"/>
+          <w:sz w:val="19"/>
+          <w:szCs w:val="19"/>
         </w:rPr>
         <w:t>company</w:t>
       </w:r>
@@ -1479,8 +1191,8 @@
           <w:b/>
           <w:bCs/>
           <w:color w:val="4A7C2F"/>
-          <w:sz w:val="32"/>
-          <w:szCs w:val="32"/>
+          <w:sz w:val="19"/>
+          <w:szCs w:val="19"/>
         </w:rPr>
         <w:t xml:space="preserve"> }</w:t>
       </w:r>
@@ -1491,8 +1203,8 @@
           <w:b/>
           <w:bCs/>
           <w:color w:val="4A7C2F"/>
-          <w:sz w:val="32"/>
-          <w:szCs w:val="32"/>
+          <w:sz w:val="19"/>
+          <w:szCs w:val="19"/>
         </w:rPr>
         <w:t>}</w:t>
       </w:r>
@@ -1500,27 +1212,18 @@
         <w:rPr>
           <w:rFonts w:ascii="Calibri" w:eastAsia="Calibri" w:hAnsi="Calibri" w:cs="Calibri"/>
           <w:color w:val="7A7A6E"/>
-          <w:sz w:val="32"/>
-          <w:szCs w:val="32"/>
-        </w:rPr>
-        <w:t xml:space="preserve">   </w:t>
-      </w:r>
-      <w:r>
-        <w:rPr>
-          <w:rFonts w:ascii="Calibri" w:eastAsia="Calibri" w:hAnsi="Calibri" w:cs="Calibri"/>
-          <w:color w:val="7A7A6E"/>
-          <w:sz w:val="28"/>
-          <w:szCs w:val="28"/>
-        </w:rPr>
-        <w:t>•</w:t>
+          <w:sz w:val="17"/>
+          <w:szCs w:val="17"/>
+        </w:rPr>
+        <w:t xml:space="preserve">   •</w:t>
       </w:r>
       <w:proofErr w:type="gramStart"/>
       <w:r>
         <w:rPr>
           <w:rFonts w:ascii="Calibri" w:eastAsia="Calibri" w:hAnsi="Calibri" w:cs="Calibri"/>
           <w:color w:val="7A7A6E"/>
-          <w:sz w:val="28"/>
-          <w:szCs w:val="28"/>
+          <w:sz w:val="17"/>
+          <w:szCs w:val="17"/>
         </w:rPr>
         <w:t xml:space="preserve">   {{ </w:t>
       </w:r>
@@ -1529,8 +1232,8 @@
         <w:rPr>
           <w:rFonts w:ascii="Calibri" w:eastAsia="Calibri" w:hAnsi="Calibri" w:cs="Calibri"/>
           <w:color w:val="7A7A6E"/>
-          <w:sz w:val="28"/>
-          <w:szCs w:val="28"/>
+          <w:sz w:val="17"/>
+          <w:szCs w:val="17"/>
         </w:rPr>
         <w:t>exp</w:t>
       </w:r>
@@ -1539,8 +1242,8 @@
         <w:rPr>
           <w:rFonts w:ascii="Calibri" w:eastAsia="Calibri" w:hAnsi="Calibri" w:cs="Calibri"/>
           <w:color w:val="7A7A6E"/>
-          <w:sz w:val="28"/>
-          <w:szCs w:val="28"/>
+          <w:sz w:val="17"/>
+          <w:szCs w:val="17"/>
         </w:rPr>
         <w:t>.</w:t>
       </w:r>
@@ -1549,8 +1252,8 @@
         <w:rPr>
           <w:rFonts w:ascii="Calibri" w:eastAsia="Calibri" w:hAnsi="Calibri" w:cs="Calibri"/>
           <w:color w:val="7A7A6E"/>
-          <w:sz w:val="28"/>
-          <w:szCs w:val="28"/>
+          <w:sz w:val="17"/>
+          <w:szCs w:val="17"/>
         </w:rPr>
         <w:t>location</w:t>
       </w:r>
@@ -1559,8 +1262,8 @@
         <w:rPr>
           <w:rFonts w:ascii="Calibri" w:eastAsia="Calibri" w:hAnsi="Calibri" w:cs="Calibri"/>
           <w:color w:val="7A7A6E"/>
-          <w:sz w:val="28"/>
-          <w:szCs w:val="28"/>
+          <w:sz w:val="17"/>
+          <w:szCs w:val="17"/>
         </w:rPr>
         <w:t xml:space="preserve"> }</w:t>
       </w:r>
@@ -1569,25 +1272,19 @@
         <w:rPr>
           <w:rFonts w:ascii="Calibri" w:eastAsia="Calibri" w:hAnsi="Calibri" w:cs="Calibri"/>
           <w:color w:val="7A7A6E"/>
-          <w:sz w:val="28"/>
-          <w:szCs w:val="28"/>
+          <w:sz w:val="17"/>
+          <w:szCs w:val="17"/>
         </w:rPr>
         <w:t>}</w:t>
       </w:r>
     </w:p>
     <w:p>
-      <w:pPr>
-        <w:rPr>
-          <w:sz w:val="28"/>
-          <w:szCs w:val="28"/>
-        </w:rPr>
-      </w:pPr>
-      <w:r>
-        <w:rPr>
-          <w:rFonts w:ascii="Calibri" w:eastAsia="Calibri" w:hAnsi="Calibri" w:cs="Calibri"/>
-          <w:color w:val="3C3C3C"/>
-          <w:sz w:val="28"/>
-          <w:szCs w:val="28"/>
+      <w:r>
+        <w:rPr>
+          <w:rFonts w:ascii="Calibri" w:eastAsia="Calibri" w:hAnsi="Calibri" w:cs="Calibri"/>
+          <w:color w:val="3C3C3C"/>
+          <w:sz w:val="18"/>
+          <w:szCs w:val="18"/>
         </w:rPr>
         <w:t xml:space="preserve">{% for bullet in </w:t>
       </w:r>
@@ -1597,8 +1294,8 @@
         <w:rPr>
           <w:rFonts w:ascii="Calibri" w:eastAsia="Calibri" w:hAnsi="Calibri" w:cs="Calibri"/>
           <w:color w:val="3C3C3C"/>
-          <w:sz w:val="28"/>
-          <w:szCs w:val="28"/>
+          <w:sz w:val="18"/>
+          <w:szCs w:val="18"/>
         </w:rPr>
         <w:t>exp.bullets</w:t>
       </w:r>
@@ -1608,8 +1305,8 @@
         <w:rPr>
           <w:rFonts w:ascii="Calibri" w:eastAsia="Calibri" w:hAnsi="Calibri" w:cs="Calibri"/>
           <w:color w:val="3C3C3C"/>
-          <w:sz w:val="28"/>
-          <w:szCs w:val="28"/>
+          <w:sz w:val="18"/>
+          <w:szCs w:val="18"/>
         </w:rPr>
         <w:t xml:space="preserve"> %}</w:t>
       </w:r>
@@ -1622,18 +1319,14 @@
           <w:numId w:val="2"/>
         </w:numPr>
         <w:spacing w:before="40" w:after="40"/>
-        <w:rPr>
-          <w:sz w:val="28"/>
-          <w:szCs w:val="28"/>
-        </w:rPr>
       </w:pPr>
       <w:proofErr w:type="gramStart"/>
       <w:r>
         <w:rPr>
           <w:rFonts w:ascii="Calibri" w:eastAsia="Calibri" w:hAnsi="Calibri" w:cs="Calibri"/>
           <w:color w:val="3C3C3C"/>
-          <w:sz w:val="28"/>
-          <w:szCs w:val="28"/>
+          <w:sz w:val="19"/>
+          <w:szCs w:val="19"/>
         </w:rPr>
         <w:t>{{ bullet</w:t>
       </w:r>
@@ -1642,25 +1335,19 @@
         <w:rPr>
           <w:rFonts w:ascii="Calibri" w:eastAsia="Calibri" w:hAnsi="Calibri" w:cs="Calibri"/>
           <w:color w:val="3C3C3C"/>
-          <w:sz w:val="28"/>
-          <w:szCs w:val="28"/>
+          <w:sz w:val="19"/>
+          <w:szCs w:val="19"/>
         </w:rPr>
         <w:t xml:space="preserve"> }}</w:t>
       </w:r>
     </w:p>
     <w:p>
-      <w:pPr>
-        <w:rPr>
-          <w:sz w:val="28"/>
-          <w:szCs w:val="28"/>
-        </w:rPr>
-      </w:pPr>
-      <w:r>
-        <w:rPr>
-          <w:rFonts w:ascii="Calibri" w:eastAsia="Calibri" w:hAnsi="Calibri" w:cs="Calibri"/>
-          <w:color w:val="3C3C3C"/>
-          <w:sz w:val="28"/>
-          <w:szCs w:val="28"/>
+      <w:r>
+        <w:rPr>
+          <w:rFonts w:ascii="Calibri" w:eastAsia="Calibri" w:hAnsi="Calibri" w:cs="Calibri"/>
+          <w:color w:val="3C3C3C"/>
+          <w:sz w:val="18"/>
+          <w:szCs w:val="18"/>
         </w:rPr>
         <w:t xml:space="preserve">{% </w:t>
       </w:r>
@@ -1669,8 +1356,8 @@
         <w:rPr>
           <w:rFonts w:ascii="Calibri" w:eastAsia="Calibri" w:hAnsi="Calibri" w:cs="Calibri"/>
           <w:color w:val="3C3C3C"/>
-          <w:sz w:val="28"/>
-          <w:szCs w:val="28"/>
+          <w:sz w:val="18"/>
+          <w:szCs w:val="18"/>
         </w:rPr>
         <w:t>endfor</w:t>
       </w:r>
@@ -1679,8 +1366,8 @@
         <w:rPr>
           <w:rFonts w:ascii="Calibri" w:eastAsia="Calibri" w:hAnsi="Calibri" w:cs="Calibri"/>
           <w:color w:val="3C3C3C"/>
-          <w:sz w:val="28"/>
-          <w:szCs w:val="28"/>
+          <w:sz w:val="18"/>
+          <w:szCs w:val="18"/>
         </w:rPr>
         <w:t xml:space="preserve"> %}</w:t>
       </w:r>
@@ -1688,31 +1375,15 @@
     <w:p>
       <w:pPr>
         <w:spacing w:after="120"/>
-        <w:rPr>
-          <w:sz w:val="28"/>
-          <w:szCs w:val="28"/>
-        </w:rPr>
       </w:pPr>
     </w:p>
     <w:p>
-      <w:pPr>
-        <w:rPr>
-          <w:sz w:val="28"/>
-          <w:szCs w:val="28"/>
-        </w:rPr>
-        <w:sectPr>
-          <w:pgSz w:w="11906" w:h="16838"/>
-          <w:pgMar w:top="0" w:right="720" w:bottom="720" w:left="720" w:header="708" w:footer="708" w:gutter="0"/>
-          <w:cols w:space="720"/>
-          <w:docGrid w:linePitch="360"/>
-        </w:sectPr>
-      </w:pPr>
-      <w:r>
-        <w:rPr>
-          <w:rFonts w:ascii="Calibri" w:eastAsia="Calibri" w:hAnsi="Calibri" w:cs="Calibri"/>
-          <w:color w:val="3C3C3C"/>
-          <w:sz w:val="28"/>
-          <w:szCs w:val="28"/>
+      <w:r>
+        <w:rPr>
+          <w:rFonts w:ascii="Calibri" w:eastAsia="Calibri" w:hAnsi="Calibri" w:cs="Calibri"/>
+          <w:color w:val="3C3C3C"/>
+          <w:sz w:val="18"/>
+          <w:szCs w:val="18"/>
         </w:rPr>
         <w:t xml:space="preserve">{% </w:t>
       </w:r>
@@ -1721,8 +1392,8 @@
         <w:rPr>
           <w:rFonts w:ascii="Calibri" w:eastAsia="Calibri" w:hAnsi="Calibri" w:cs="Calibri"/>
           <w:color w:val="3C3C3C"/>
-          <w:sz w:val="28"/>
-          <w:szCs w:val="28"/>
+          <w:sz w:val="18"/>
+          <w:szCs w:val="18"/>
         </w:rPr>
         <w:t>endfor</w:t>
       </w:r>
@@ -1731,20 +1402,21 @@
         <w:rPr>
           <w:rFonts w:ascii="Calibri" w:eastAsia="Calibri" w:hAnsi="Calibri" w:cs="Calibri"/>
           <w:color w:val="3C3C3C"/>
-          <w:sz w:val="28"/>
-          <w:szCs w:val="28"/>
+          <w:sz w:val="18"/>
+          <w:szCs w:val="18"/>
         </w:rPr>
         <w:t xml:space="preserve"> %}</w:t>
       </w:r>
     </w:p>
     <w:p>
-      <w:pPr>
-        <w:rPr>
-          <w:sz w:val="40"/>
-          <w:szCs w:val="40"/>
-        </w:rPr>
-      </w:pPr>
-    </w:p>
+      <w:r>
+        <w:br/>
+      </w:r>
+      <w:r>
+        <w:br w:type="page"/>
+      </w:r>
+    </w:p>
+    <w:p/>
     <w:tbl>
       <w:tblPr>
         <w:tblW w:w="10466" w:type="dxa"/>
@@ -1767,12 +1439,6 @@
         <w:gridCol w:w="10286"/>
       </w:tblGrid>
       <w:tr>
-        <w:tblPrEx>
-          <w:tblCellMar>
-            <w:top w:w="0" w:type="dxa"/>
-            <w:bottom w:w="0" w:type="dxa"/>
-          </w:tblCellMar>
-        </w:tblPrEx>
         <w:tc>
           <w:tcPr>
             <w:tcW w:w="180" w:type="dxa"/>
@@ -1790,14 +1456,7 @@
               <w:right w:w="0" w:type="dxa"/>
             </w:tcMar>
           </w:tcPr>
-          <w:p>
-            <w:pPr>
-              <w:rPr>
-                <w:sz w:val="40"/>
-                <w:szCs w:val="40"/>
-              </w:rPr>
-            </w:pPr>
-          </w:p>
+          <w:p/>
         </w:tc>
         <w:tc>
           <w:tcPr>
@@ -1817,12 +1476,6 @@
             </w:tcMar>
           </w:tcPr>
           <w:p>
-            <w:pPr>
-              <w:rPr>
-                <w:sz w:val="40"/>
-                <w:szCs w:val="40"/>
-              </w:rPr>
-            </w:pPr>
             <w:r>
               <w:rPr>
                 <w:rFonts w:ascii="Calibri" w:eastAsia="Calibri" w:hAnsi="Calibri" w:cs="Calibri"/>
@@ -1830,8 +1483,8 @@
                 <w:bCs/>
                 <w:caps/>
                 <w:color w:val="2D5016"/>
-                <w:sz w:val="40"/>
-                <w:szCs w:val="40"/>
+                <w:sz w:val="22"/>
+                <w:szCs w:val="22"/>
               </w:rPr>
               <w:t>Education</w:t>
             </w:r>
@@ -1842,25 +1495,15 @@
     <w:p>
       <w:pPr>
         <w:spacing w:after="80"/>
-        <w:rPr>
-          <w:sz w:val="28"/>
-          <w:szCs w:val="28"/>
-        </w:rPr>
       </w:pPr>
     </w:p>
     <w:p>
-      <w:pPr>
-        <w:rPr>
-          <w:sz w:val="28"/>
-          <w:szCs w:val="28"/>
-        </w:rPr>
-      </w:pPr>
-      <w:r>
-        <w:rPr>
-          <w:rFonts w:ascii="Calibri" w:eastAsia="Calibri" w:hAnsi="Calibri" w:cs="Calibri"/>
-          <w:color w:val="3C3C3C"/>
-          <w:sz w:val="28"/>
-          <w:szCs w:val="28"/>
+      <w:r>
+        <w:rPr>
+          <w:rFonts w:ascii="Calibri" w:eastAsia="Calibri" w:hAnsi="Calibri" w:cs="Calibri"/>
+          <w:color w:val="3C3C3C"/>
+          <w:sz w:val="18"/>
+          <w:szCs w:val="18"/>
         </w:rPr>
         <w:t xml:space="preserve">{% for </w:t>
       </w:r>
@@ -1869,8 +1512,8 @@
         <w:rPr>
           <w:rFonts w:ascii="Calibri" w:eastAsia="Calibri" w:hAnsi="Calibri" w:cs="Calibri"/>
           <w:color w:val="3C3C3C"/>
-          <w:sz w:val="28"/>
-          <w:szCs w:val="28"/>
+          <w:sz w:val="18"/>
+          <w:szCs w:val="18"/>
         </w:rPr>
         <w:t>edu</w:t>
       </w:r>
@@ -1879,8 +1522,8 @@
         <w:rPr>
           <w:rFonts w:ascii="Calibri" w:eastAsia="Calibri" w:hAnsi="Calibri" w:cs="Calibri"/>
           <w:color w:val="3C3C3C"/>
-          <w:sz w:val="28"/>
-          <w:szCs w:val="28"/>
+          <w:sz w:val="18"/>
+          <w:szCs w:val="18"/>
         </w:rPr>
         <w:t xml:space="preserve"> in education %}</w:t>
       </w:r>
@@ -1888,10 +1531,6 @@
     <w:p>
       <w:pPr>
         <w:spacing w:before="100" w:after="30"/>
-        <w:rPr>
-          <w:sz w:val="32"/>
-          <w:szCs w:val="32"/>
-        </w:rPr>
       </w:pPr>
       <w:proofErr w:type="gramStart"/>
       <w:r>
@@ -1900,8 +1539,8 @@
           <w:b/>
           <w:bCs/>
           <w:color w:val="1A1A1A"/>
-          <w:sz w:val="32"/>
-          <w:szCs w:val="32"/>
+          <w:sz w:val="22"/>
+          <w:szCs w:val="22"/>
         </w:rPr>
         <w:t xml:space="preserve">{{ </w:t>
       </w:r>
@@ -1912,8 +1551,8 @@
           <w:b/>
           <w:bCs/>
           <w:color w:val="1A1A1A"/>
-          <w:sz w:val="32"/>
-          <w:szCs w:val="32"/>
+          <w:sz w:val="22"/>
+          <w:szCs w:val="22"/>
         </w:rPr>
         <w:t>edu</w:t>
       </w:r>
@@ -1924,8 +1563,8 @@
           <w:b/>
           <w:bCs/>
           <w:color w:val="1A1A1A"/>
-          <w:sz w:val="32"/>
-          <w:szCs w:val="32"/>
+          <w:sz w:val="22"/>
+          <w:szCs w:val="22"/>
         </w:rPr>
         <w:t>.</w:t>
       </w:r>
@@ -1936,8 +1575,8 @@
           <w:b/>
           <w:bCs/>
           <w:color w:val="1A1A1A"/>
-          <w:sz w:val="32"/>
-          <w:szCs w:val="32"/>
+          <w:sz w:val="22"/>
+          <w:szCs w:val="22"/>
         </w:rPr>
         <w:t>degree</w:t>
       </w:r>
@@ -1948,8 +1587,8 @@
           <w:b/>
           <w:bCs/>
           <w:color w:val="1A1A1A"/>
-          <w:sz w:val="32"/>
-          <w:szCs w:val="32"/>
+          <w:sz w:val="22"/>
+          <w:szCs w:val="22"/>
         </w:rPr>
         <w:t xml:space="preserve"> }</w:t>
       </w:r>
@@ -1960,8 +1599,8 @@
           <w:b/>
           <w:bCs/>
           <w:color w:val="1A1A1A"/>
-          <w:sz w:val="32"/>
-          <w:szCs w:val="32"/>
+          <w:sz w:val="22"/>
+          <w:szCs w:val="22"/>
         </w:rPr>
         <w:t>}</w:t>
       </w:r>
@@ -1969,10 +1608,6 @@
     <w:p>
       <w:pPr>
         <w:spacing w:after="30"/>
-        <w:rPr>
-          <w:sz w:val="28"/>
-          <w:szCs w:val="28"/>
-        </w:rPr>
       </w:pPr>
       <w:proofErr w:type="gramStart"/>
       <w:r>
@@ -1981,8 +1616,6 @@
           <w:b/>
           <w:bCs/>
           <w:color w:val="4A7C2F"/>
-          <w:sz w:val="32"/>
-          <w:szCs w:val="32"/>
         </w:rPr>
         <w:t xml:space="preserve">{{ </w:t>
       </w:r>
@@ -1993,8 +1626,6 @@
           <w:b/>
           <w:bCs/>
           <w:color w:val="4A7C2F"/>
-          <w:sz w:val="32"/>
-          <w:szCs w:val="32"/>
         </w:rPr>
         <w:t>edu</w:t>
       </w:r>
@@ -2005,8 +1636,6 @@
           <w:b/>
           <w:bCs/>
           <w:color w:val="4A7C2F"/>
-          <w:sz w:val="32"/>
-          <w:szCs w:val="32"/>
         </w:rPr>
         <w:t>.</w:t>
       </w:r>
@@ -2017,8 +1646,6 @@
           <w:b/>
           <w:bCs/>
           <w:color w:val="4A7C2F"/>
-          <w:sz w:val="32"/>
-          <w:szCs w:val="32"/>
         </w:rPr>
         <w:t>institution</w:t>
       </w:r>
@@ -2029,8 +1656,6 @@
           <w:b/>
           <w:bCs/>
           <w:color w:val="4A7C2F"/>
-          <w:sz w:val="32"/>
-          <w:szCs w:val="32"/>
         </w:rPr>
         <w:t xml:space="preserve"> }</w:t>
       </w:r>
@@ -2041,8 +1666,6 @@
           <w:b/>
           <w:bCs/>
           <w:color w:val="4A7C2F"/>
-          <w:sz w:val="32"/>
-          <w:szCs w:val="32"/>
         </w:rPr>
         <w:t>}</w:t>
       </w:r>
@@ -2050,27 +1673,18 @@
         <w:rPr>
           <w:rFonts w:ascii="Calibri" w:eastAsia="Calibri" w:hAnsi="Calibri" w:cs="Calibri"/>
           <w:color w:val="7A7A6E"/>
-          <w:sz w:val="32"/>
-          <w:szCs w:val="32"/>
-        </w:rPr>
-        <w:t xml:space="preserve">   </w:t>
-      </w:r>
-      <w:r>
-        <w:rPr>
-          <w:rFonts w:ascii="Calibri" w:eastAsia="Calibri" w:hAnsi="Calibri" w:cs="Calibri"/>
-          <w:color w:val="7A7A6E"/>
-          <w:sz w:val="28"/>
-          <w:szCs w:val="28"/>
-        </w:rPr>
-        <w:t>•</w:t>
+          <w:sz w:val="18"/>
+          <w:szCs w:val="18"/>
+        </w:rPr>
+        <w:t xml:space="preserve">   •</w:t>
       </w:r>
       <w:proofErr w:type="gramStart"/>
       <w:r>
         <w:rPr>
           <w:rFonts w:ascii="Calibri" w:eastAsia="Calibri" w:hAnsi="Calibri" w:cs="Calibri"/>
           <w:color w:val="7A7A6E"/>
-          <w:sz w:val="28"/>
-          <w:szCs w:val="28"/>
+          <w:sz w:val="18"/>
+          <w:szCs w:val="18"/>
         </w:rPr>
         <w:t xml:space="preserve">   {{ </w:t>
       </w:r>
@@ -2079,8 +1693,8 @@
         <w:rPr>
           <w:rFonts w:ascii="Calibri" w:eastAsia="Calibri" w:hAnsi="Calibri" w:cs="Calibri"/>
           <w:color w:val="7A7A6E"/>
-          <w:sz w:val="28"/>
-          <w:szCs w:val="28"/>
+          <w:sz w:val="18"/>
+          <w:szCs w:val="18"/>
         </w:rPr>
         <w:t>edu</w:t>
       </w:r>
@@ -2089,8 +1703,8 @@
         <w:rPr>
           <w:rFonts w:ascii="Calibri" w:eastAsia="Calibri" w:hAnsi="Calibri" w:cs="Calibri"/>
           <w:color w:val="7A7A6E"/>
-          <w:sz w:val="28"/>
-          <w:szCs w:val="28"/>
+          <w:sz w:val="18"/>
+          <w:szCs w:val="18"/>
         </w:rPr>
         <w:t>.</w:t>
       </w:r>
@@ -2099,8 +1713,8 @@
         <w:rPr>
           <w:rFonts w:ascii="Calibri" w:eastAsia="Calibri" w:hAnsi="Calibri" w:cs="Calibri"/>
           <w:color w:val="7A7A6E"/>
-          <w:sz w:val="28"/>
-          <w:szCs w:val="28"/>
+          <w:sz w:val="18"/>
+          <w:szCs w:val="18"/>
         </w:rPr>
         <w:t>city</w:t>
       </w:r>
@@ -2109,8 +1723,8 @@
         <w:rPr>
           <w:rFonts w:ascii="Calibri" w:eastAsia="Calibri" w:hAnsi="Calibri" w:cs="Calibri"/>
           <w:color w:val="7A7A6E"/>
-          <w:sz w:val="28"/>
-          <w:szCs w:val="28"/>
+          <w:sz w:val="18"/>
+          <w:szCs w:val="18"/>
         </w:rPr>
         <w:t xml:space="preserve"> }</w:t>
       </w:r>
@@ -2119,8 +1733,8 @@
         <w:rPr>
           <w:rFonts w:ascii="Calibri" w:eastAsia="Calibri" w:hAnsi="Calibri" w:cs="Calibri"/>
           <w:color w:val="7A7A6E"/>
-          <w:sz w:val="28"/>
-          <w:szCs w:val="28"/>
+          <w:sz w:val="18"/>
+          <w:szCs w:val="18"/>
         </w:rPr>
         <w:t xml:space="preserve">}, </w:t>
       </w:r>
@@ -2129,8 +1743,8 @@
         <w:rPr>
           <w:rFonts w:ascii="Calibri" w:eastAsia="Calibri" w:hAnsi="Calibri" w:cs="Calibri"/>
           <w:color w:val="7A7A6E"/>
-          <w:sz w:val="28"/>
-          <w:szCs w:val="28"/>
+          <w:sz w:val="18"/>
+          <w:szCs w:val="18"/>
         </w:rPr>
         <w:t xml:space="preserve">{{ </w:t>
       </w:r>
@@ -2139,8 +1753,8 @@
         <w:rPr>
           <w:rFonts w:ascii="Calibri" w:eastAsia="Calibri" w:hAnsi="Calibri" w:cs="Calibri"/>
           <w:color w:val="7A7A6E"/>
-          <w:sz w:val="28"/>
-          <w:szCs w:val="28"/>
+          <w:sz w:val="18"/>
+          <w:szCs w:val="18"/>
         </w:rPr>
         <w:t>edu</w:t>
       </w:r>
@@ -2149,8 +1763,8 @@
         <w:rPr>
           <w:rFonts w:ascii="Calibri" w:eastAsia="Calibri" w:hAnsi="Calibri" w:cs="Calibri"/>
           <w:color w:val="7A7A6E"/>
-          <w:sz w:val="28"/>
-          <w:szCs w:val="28"/>
+          <w:sz w:val="18"/>
+          <w:szCs w:val="18"/>
         </w:rPr>
         <w:t>.</w:t>
       </w:r>
@@ -2159,8 +1773,8 @@
         <w:rPr>
           <w:rFonts w:ascii="Calibri" w:eastAsia="Calibri" w:hAnsi="Calibri" w:cs="Calibri"/>
           <w:color w:val="7A7A6E"/>
-          <w:sz w:val="28"/>
-          <w:szCs w:val="28"/>
+          <w:sz w:val="18"/>
+          <w:szCs w:val="18"/>
         </w:rPr>
         <w:t>country</w:t>
       </w:r>
@@ -2169,8 +1783,8 @@
         <w:rPr>
           <w:rFonts w:ascii="Calibri" w:eastAsia="Calibri" w:hAnsi="Calibri" w:cs="Calibri"/>
           <w:color w:val="7A7A6E"/>
-          <w:sz w:val="28"/>
-          <w:szCs w:val="28"/>
+          <w:sz w:val="18"/>
+          <w:szCs w:val="18"/>
         </w:rPr>
         <w:t xml:space="preserve"> }</w:t>
       </w:r>
@@ -2179,8 +1793,8 @@
         <w:rPr>
           <w:rFonts w:ascii="Calibri" w:eastAsia="Calibri" w:hAnsi="Calibri" w:cs="Calibri"/>
           <w:color w:val="7A7A6E"/>
-          <w:sz w:val="28"/>
-          <w:szCs w:val="28"/>
+          <w:sz w:val="18"/>
+          <w:szCs w:val="18"/>
         </w:rPr>
         <w:t>}</w:t>
       </w:r>
@@ -2188,10 +1802,6 @@
     <w:p>
       <w:pPr>
         <w:spacing w:after="30"/>
-        <w:rPr>
-          <w:sz w:val="28"/>
-          <w:szCs w:val="28"/>
-        </w:rPr>
       </w:pPr>
       <w:proofErr w:type="gramStart"/>
       <w:r>
@@ -2200,8 +1810,8 @@
           <w:i/>
           <w:iCs/>
           <w:color w:val="7A7A6E"/>
-          <w:sz w:val="28"/>
-          <w:szCs w:val="28"/>
+          <w:sz w:val="17"/>
+          <w:szCs w:val="17"/>
         </w:rPr>
         <w:t xml:space="preserve">{{ </w:t>
       </w:r>
@@ -2212,8 +1822,8 @@
           <w:i/>
           <w:iCs/>
           <w:color w:val="7A7A6E"/>
-          <w:sz w:val="28"/>
-          <w:szCs w:val="28"/>
+          <w:sz w:val="17"/>
+          <w:szCs w:val="17"/>
         </w:rPr>
         <w:t>edu</w:t>
       </w:r>
@@ -2224,8 +1834,8 @@
           <w:i/>
           <w:iCs/>
           <w:color w:val="7A7A6E"/>
-          <w:sz w:val="28"/>
-          <w:szCs w:val="28"/>
+          <w:sz w:val="17"/>
+          <w:szCs w:val="17"/>
         </w:rPr>
         <w:t>.</w:t>
       </w:r>
@@ -2236,8 +1846,8 @@
           <w:i/>
           <w:iCs/>
           <w:color w:val="7A7A6E"/>
-          <w:sz w:val="28"/>
-          <w:szCs w:val="28"/>
+          <w:sz w:val="17"/>
+          <w:szCs w:val="17"/>
         </w:rPr>
         <w:t>graduationMonth</w:t>
       </w:r>
@@ -2248,8 +1858,8 @@
           <w:i/>
           <w:iCs/>
           <w:color w:val="7A7A6E"/>
-          <w:sz w:val="28"/>
-          <w:szCs w:val="28"/>
+          <w:sz w:val="17"/>
+          <w:szCs w:val="17"/>
         </w:rPr>
         <w:t xml:space="preserve"> }</w:t>
       </w:r>
@@ -2260,8 +1870,8 @@
           <w:i/>
           <w:iCs/>
           <w:color w:val="7A7A6E"/>
-          <w:sz w:val="28"/>
-          <w:szCs w:val="28"/>
+          <w:sz w:val="17"/>
+          <w:szCs w:val="17"/>
         </w:rPr>
         <w:t xml:space="preserve">} </w:t>
       </w:r>
@@ -2272,8 +1882,8 @@
           <w:i/>
           <w:iCs/>
           <w:color w:val="7A7A6E"/>
-          <w:sz w:val="28"/>
-          <w:szCs w:val="28"/>
+          <w:sz w:val="17"/>
+          <w:szCs w:val="17"/>
         </w:rPr>
         <w:t xml:space="preserve">{{ </w:t>
       </w:r>
@@ -2284,8 +1894,8 @@
           <w:i/>
           <w:iCs/>
           <w:color w:val="7A7A6E"/>
-          <w:sz w:val="28"/>
-          <w:szCs w:val="28"/>
+          <w:sz w:val="17"/>
+          <w:szCs w:val="17"/>
         </w:rPr>
         <w:t>edu</w:t>
       </w:r>
@@ -2296,8 +1906,8 @@
           <w:i/>
           <w:iCs/>
           <w:color w:val="7A7A6E"/>
-          <w:sz w:val="28"/>
-          <w:szCs w:val="28"/>
+          <w:sz w:val="17"/>
+          <w:szCs w:val="17"/>
         </w:rPr>
         <w:t>.</w:t>
       </w:r>
@@ -2308,8 +1918,8 @@
           <w:i/>
           <w:iCs/>
           <w:color w:val="7A7A6E"/>
-          <w:sz w:val="28"/>
-          <w:szCs w:val="28"/>
+          <w:sz w:val="17"/>
+          <w:szCs w:val="17"/>
         </w:rPr>
         <w:t>expected</w:t>
       </w:r>
@@ -2320,8 +1930,8 @@
           <w:i/>
           <w:iCs/>
           <w:color w:val="7A7A6E"/>
-          <w:sz w:val="28"/>
-          <w:szCs w:val="28"/>
+          <w:sz w:val="17"/>
+          <w:szCs w:val="17"/>
         </w:rPr>
         <w:t xml:space="preserve"> }</w:t>
       </w:r>
@@ -2332,25 +1942,19 @@
           <w:i/>
           <w:iCs/>
           <w:color w:val="7A7A6E"/>
-          <w:sz w:val="28"/>
-          <w:szCs w:val="28"/>
+          <w:sz w:val="17"/>
+          <w:szCs w:val="17"/>
         </w:rPr>
         <w:t>}</w:t>
       </w:r>
     </w:p>
     <w:p>
-      <w:pPr>
-        <w:rPr>
-          <w:sz w:val="28"/>
-          <w:szCs w:val="28"/>
-        </w:rPr>
-      </w:pPr>
-      <w:r>
-        <w:rPr>
-          <w:rFonts w:ascii="Calibri" w:eastAsia="Calibri" w:hAnsi="Calibri" w:cs="Calibri"/>
-          <w:color w:val="3C3C3C"/>
-          <w:sz w:val="28"/>
-          <w:szCs w:val="28"/>
+      <w:r>
+        <w:rPr>
+          <w:rFonts w:ascii="Calibri" w:eastAsia="Calibri" w:hAnsi="Calibri" w:cs="Calibri"/>
+          <w:color w:val="3C3C3C"/>
+          <w:sz w:val="18"/>
+          <w:szCs w:val="18"/>
         </w:rPr>
         <w:t xml:space="preserve">{% if </w:t>
       </w:r>
@@ -2360,8 +1964,8 @@
         <w:rPr>
           <w:rFonts w:ascii="Calibri" w:eastAsia="Calibri" w:hAnsi="Calibri" w:cs="Calibri"/>
           <w:color w:val="3C3C3C"/>
-          <w:sz w:val="28"/>
-          <w:szCs w:val="28"/>
+          <w:sz w:val="18"/>
+          <w:szCs w:val="18"/>
         </w:rPr>
         <w:t>edu.minimumAverage</w:t>
       </w:r>
@@ -2371,8 +1975,8 @@
         <w:rPr>
           <w:rFonts w:ascii="Calibri" w:eastAsia="Calibri" w:hAnsi="Calibri" w:cs="Calibri"/>
           <w:color w:val="3C3C3C"/>
-          <w:sz w:val="28"/>
-          <w:szCs w:val="28"/>
+          <w:sz w:val="18"/>
+          <w:szCs w:val="18"/>
         </w:rPr>
         <w:t xml:space="preserve"> %}</w:t>
       </w:r>
@@ -2380,10 +1984,6 @@
     <w:p>
       <w:pPr>
         <w:spacing w:after="60"/>
-        <w:rPr>
-          <w:sz w:val="28"/>
-          <w:szCs w:val="28"/>
-        </w:rPr>
       </w:pPr>
       <w:r>
         <w:rPr>
@@ -2391,8 +1991,8 @@
           <w:b/>
           <w:bCs/>
           <w:color w:val="3C3C3C"/>
-          <w:sz w:val="32"/>
-          <w:szCs w:val="32"/>
+          <w:sz w:val="18"/>
+          <w:szCs w:val="18"/>
         </w:rPr>
         <w:t xml:space="preserve">Minimum Average: </w:t>
       </w:r>
@@ -2400,11 +2000,9 @@
       <w:r>
         <w:rPr>
           <w:rFonts w:ascii="Calibri" w:eastAsia="Calibri" w:hAnsi="Calibri" w:cs="Calibri"/>
-          <w:b/>
-          <w:bCs/>
           <w:color w:val="2D5016"/>
-          <w:sz w:val="32"/>
-          <w:szCs w:val="32"/>
+          <w:sz w:val="18"/>
+          <w:szCs w:val="18"/>
         </w:rPr>
         <w:t xml:space="preserve">{{ </w:t>
       </w:r>
@@ -2412,11 +2010,9 @@
       <w:r>
         <w:rPr>
           <w:rFonts w:ascii="Calibri" w:eastAsia="Calibri" w:hAnsi="Calibri" w:cs="Calibri"/>
-          <w:b/>
-          <w:bCs/>
           <w:color w:val="2D5016"/>
-          <w:sz w:val="32"/>
-          <w:szCs w:val="32"/>
+          <w:sz w:val="18"/>
+          <w:szCs w:val="18"/>
         </w:rPr>
         <w:t>edu</w:t>
       </w:r>
@@ -2424,11 +2020,9 @@
       <w:r>
         <w:rPr>
           <w:rFonts w:ascii="Calibri" w:eastAsia="Calibri" w:hAnsi="Calibri" w:cs="Calibri"/>
-          <w:b/>
-          <w:bCs/>
           <w:color w:val="2D5016"/>
-          <w:sz w:val="32"/>
-          <w:szCs w:val="32"/>
+          <w:sz w:val="18"/>
+          <w:szCs w:val="18"/>
         </w:rPr>
         <w:t>.</w:t>
       </w:r>
@@ -2436,11 +2030,9 @@
       <w:r>
         <w:rPr>
           <w:rFonts w:ascii="Calibri" w:eastAsia="Calibri" w:hAnsi="Calibri" w:cs="Calibri"/>
-          <w:b/>
-          <w:bCs/>
           <w:color w:val="2D5016"/>
-          <w:sz w:val="32"/>
-          <w:szCs w:val="32"/>
+          <w:sz w:val="18"/>
+          <w:szCs w:val="18"/>
         </w:rPr>
         <w:t>minimumAverage</w:t>
       </w:r>
@@ -2448,30 +2040,19 @@
       <w:r>
         <w:rPr>
           <w:rFonts w:ascii="Calibri" w:eastAsia="Calibri" w:hAnsi="Calibri" w:cs="Calibri"/>
-          <w:b/>
-          <w:bCs/>
           <w:color w:val="2D5016"/>
-          <w:sz w:val="32"/>
-          <w:szCs w:val="32"/>
-        </w:rPr>
-        <w:t xml:space="preserve"> }}</w:t>
-      </w:r>
+          <w:sz w:val="18"/>
+          <w:szCs w:val="18"/>
+        </w:rPr>
+        <w:t xml:space="preserve"> }}{</w:t>
+      </w:r>
+      <w:proofErr w:type="gramEnd"/>
       <w:r>
         <w:rPr>
           <w:rFonts w:ascii="Calibri" w:eastAsia="Calibri" w:hAnsi="Calibri" w:cs="Calibri"/>
           <w:color w:val="2D5016"/>
-          <w:sz w:val="28"/>
-          <w:szCs w:val="28"/>
-        </w:rPr>
-        <w:t>{</w:t>
-      </w:r>
-      <w:proofErr w:type="gramEnd"/>
-      <w:r>
-        <w:rPr>
-          <w:rFonts w:ascii="Calibri" w:eastAsia="Calibri" w:hAnsi="Calibri" w:cs="Calibri"/>
-          <w:color w:val="2D5016"/>
-          <w:sz w:val="28"/>
-          <w:szCs w:val="28"/>
+          <w:sz w:val="18"/>
+          <w:szCs w:val="18"/>
         </w:rPr>
         <w:t>% endif %}</w:t>
       </w:r>
@@ -2482,10 +2063,6 @@
           <w:bottom w:val="single" w:sz="4" w:space="0" w:color="C8D8B0"/>
         </w:pBdr>
         <w:spacing w:before="80" w:after="60"/>
-        <w:rPr>
-          <w:sz w:val="32"/>
-          <w:szCs w:val="32"/>
-        </w:rPr>
       </w:pPr>
       <w:r>
         <w:rPr>
@@ -2493,25 +2070,19 @@
           <w:b/>
           <w:bCs/>
           <w:color w:val="2D5016"/>
-          <w:sz w:val="32"/>
-          <w:szCs w:val="32"/>
+          <w:sz w:val="19"/>
+          <w:szCs w:val="19"/>
         </w:rPr>
         <w:t>Relevant Coursework:</w:t>
       </w:r>
     </w:p>
     <w:p>
-      <w:pPr>
-        <w:rPr>
-          <w:sz w:val="28"/>
-          <w:szCs w:val="28"/>
-        </w:rPr>
-      </w:pPr>
-      <w:r>
-        <w:rPr>
-          <w:rFonts w:ascii="Calibri" w:eastAsia="Calibri" w:hAnsi="Calibri" w:cs="Calibri"/>
-          <w:color w:val="3C3C3C"/>
-          <w:sz w:val="28"/>
-          <w:szCs w:val="28"/>
+      <w:r>
+        <w:rPr>
+          <w:rFonts w:ascii="Calibri" w:eastAsia="Calibri" w:hAnsi="Calibri" w:cs="Calibri"/>
+          <w:color w:val="3C3C3C"/>
+          <w:sz w:val="18"/>
+          <w:szCs w:val="18"/>
         </w:rPr>
         <w:t xml:space="preserve">{% for course in </w:t>
       </w:r>
@@ -2521,8 +2092,8 @@
         <w:rPr>
           <w:rFonts w:ascii="Calibri" w:eastAsia="Calibri" w:hAnsi="Calibri" w:cs="Calibri"/>
           <w:color w:val="3C3C3C"/>
-          <w:sz w:val="28"/>
-          <w:szCs w:val="28"/>
+          <w:sz w:val="18"/>
+          <w:szCs w:val="18"/>
         </w:rPr>
         <w:t>edu.coursework</w:t>
       </w:r>
@@ -2532,8 +2103,8 @@
         <w:rPr>
           <w:rFonts w:ascii="Calibri" w:eastAsia="Calibri" w:hAnsi="Calibri" w:cs="Calibri"/>
           <w:color w:val="3C3C3C"/>
-          <w:sz w:val="28"/>
-          <w:szCs w:val="28"/>
+          <w:sz w:val="18"/>
+          <w:szCs w:val="18"/>
         </w:rPr>
         <w:t xml:space="preserve"> %}</w:t>
       </w:r>
@@ -2546,18 +2117,14 @@
           <w:numId w:val="2"/>
         </w:numPr>
         <w:spacing w:before="30" w:after="30"/>
-        <w:rPr>
-          <w:sz w:val="28"/>
-          <w:szCs w:val="28"/>
-        </w:rPr>
       </w:pPr>
       <w:proofErr w:type="gramStart"/>
       <w:r>
         <w:rPr>
           <w:rFonts w:ascii="Calibri" w:eastAsia="Calibri" w:hAnsi="Calibri" w:cs="Calibri"/>
           <w:color w:val="3C3C3C"/>
-          <w:sz w:val="28"/>
-          <w:szCs w:val="28"/>
+          <w:sz w:val="18"/>
+          <w:szCs w:val="18"/>
         </w:rPr>
         <w:t>{{ course</w:t>
       </w:r>
@@ -2566,25 +2133,19 @@
         <w:rPr>
           <w:rFonts w:ascii="Calibri" w:eastAsia="Calibri" w:hAnsi="Calibri" w:cs="Calibri"/>
           <w:color w:val="3C3C3C"/>
-          <w:sz w:val="28"/>
-          <w:szCs w:val="28"/>
+          <w:sz w:val="18"/>
+          <w:szCs w:val="18"/>
         </w:rPr>
         <w:t xml:space="preserve"> }}</w:t>
       </w:r>
     </w:p>
     <w:p>
-      <w:pPr>
-        <w:rPr>
-          <w:sz w:val="28"/>
-          <w:szCs w:val="28"/>
-        </w:rPr>
-      </w:pPr>
-      <w:r>
-        <w:rPr>
-          <w:rFonts w:ascii="Calibri" w:eastAsia="Calibri" w:hAnsi="Calibri" w:cs="Calibri"/>
-          <w:color w:val="3C3C3C"/>
-          <w:sz w:val="28"/>
-          <w:szCs w:val="28"/>
+      <w:r>
+        <w:rPr>
+          <w:rFonts w:ascii="Calibri" w:eastAsia="Calibri" w:hAnsi="Calibri" w:cs="Calibri"/>
+          <w:color w:val="3C3C3C"/>
+          <w:sz w:val="18"/>
+          <w:szCs w:val="18"/>
         </w:rPr>
         <w:t xml:space="preserve">{% </w:t>
       </w:r>
@@ -2593,8 +2154,8 @@
         <w:rPr>
           <w:rFonts w:ascii="Calibri" w:eastAsia="Calibri" w:hAnsi="Calibri" w:cs="Calibri"/>
           <w:color w:val="3C3C3C"/>
-          <w:sz w:val="28"/>
-          <w:szCs w:val="28"/>
+          <w:sz w:val="18"/>
+          <w:szCs w:val="18"/>
         </w:rPr>
         <w:t>endfor</w:t>
       </w:r>
@@ -2603,25 +2164,19 @@
         <w:rPr>
           <w:rFonts w:ascii="Calibri" w:eastAsia="Calibri" w:hAnsi="Calibri" w:cs="Calibri"/>
           <w:color w:val="3C3C3C"/>
-          <w:sz w:val="28"/>
-          <w:szCs w:val="28"/>
+          <w:sz w:val="18"/>
+          <w:szCs w:val="18"/>
         </w:rPr>
         <w:t xml:space="preserve"> %}</w:t>
       </w:r>
     </w:p>
     <w:p>
-      <w:pPr>
-        <w:rPr>
-          <w:sz w:val="28"/>
-          <w:szCs w:val="28"/>
-        </w:rPr>
-      </w:pPr>
-      <w:r>
-        <w:rPr>
-          <w:rFonts w:ascii="Calibri" w:eastAsia="Calibri" w:hAnsi="Calibri" w:cs="Calibri"/>
-          <w:color w:val="3C3C3C"/>
-          <w:sz w:val="28"/>
-          <w:szCs w:val="28"/>
+      <w:r>
+        <w:rPr>
+          <w:rFonts w:ascii="Calibri" w:eastAsia="Calibri" w:hAnsi="Calibri" w:cs="Calibri"/>
+          <w:color w:val="3C3C3C"/>
+          <w:sz w:val="18"/>
+          <w:szCs w:val="18"/>
         </w:rPr>
         <w:t xml:space="preserve">{% </w:t>
       </w:r>
@@ -2630,8 +2185,8 @@
         <w:rPr>
           <w:rFonts w:ascii="Calibri" w:eastAsia="Calibri" w:hAnsi="Calibri" w:cs="Calibri"/>
           <w:color w:val="3C3C3C"/>
-          <w:sz w:val="28"/>
-          <w:szCs w:val="28"/>
+          <w:sz w:val="18"/>
+          <w:szCs w:val="18"/>
         </w:rPr>
         <w:t>endfor</w:t>
       </w:r>
@@ -2640,41 +2195,21 @@
         <w:rPr>
           <w:rFonts w:ascii="Calibri" w:eastAsia="Calibri" w:hAnsi="Calibri" w:cs="Calibri"/>
           <w:color w:val="3C3C3C"/>
-          <w:sz w:val="28"/>
-          <w:szCs w:val="28"/>
+          <w:sz w:val="18"/>
+          <w:szCs w:val="18"/>
         </w:rPr>
         <w:t xml:space="preserve"> %}</w:t>
       </w:r>
     </w:p>
     <w:p>
-      <w:pPr>
-        <w:rPr>
-          <w:sz w:val="28"/>
-          <w:szCs w:val="28"/>
-        </w:rPr>
-        <w:sectPr>
-          <w:pgSz w:w="11906" w:h="16838"/>
-          <w:pgMar w:top="0" w:right="720" w:bottom="720" w:left="720" w:header="708" w:footer="708" w:gutter="0"/>
-          <w:cols w:space="720"/>
-          <w:docGrid w:linePitch="360"/>
-        </w:sectPr>
-      </w:pPr>
-      <w:r>
-        <w:rPr>
-          <w:sz w:val="28"/>
-          <w:szCs w:val="28"/>
-        </w:rPr>
+      <w:r>
         <w:br/>
       </w:r>
-    </w:p>
-    <w:p>
-      <w:pPr>
-        <w:rPr>
-          <w:sz w:val="28"/>
-          <w:szCs w:val="28"/>
-        </w:rPr>
-      </w:pPr>
-    </w:p>
+      <w:r>
+        <w:br w:type="page"/>
+      </w:r>
+    </w:p>
+    <w:p/>
     <w:tbl>
       <w:tblPr>
         <w:tblW w:w="10466" w:type="dxa"/>
@@ -2697,12 +2232,6 @@
         <w:gridCol w:w="10286"/>
       </w:tblGrid>
       <w:tr>
-        <w:tblPrEx>
-          <w:tblCellMar>
-            <w:top w:w="0" w:type="dxa"/>
-            <w:bottom w:w="0" w:type="dxa"/>
-          </w:tblCellMar>
-        </w:tblPrEx>
         <w:tc>
           <w:tcPr>
             <w:tcW w:w="180" w:type="dxa"/>
@@ -2720,14 +2249,7 @@
               <w:right w:w="0" w:type="dxa"/>
             </w:tcMar>
           </w:tcPr>
-          <w:p>
-            <w:pPr>
-              <w:rPr>
-                <w:sz w:val="40"/>
-                <w:szCs w:val="40"/>
-              </w:rPr>
-            </w:pPr>
-          </w:p>
+          <w:p/>
         </w:tc>
         <w:tc>
           <w:tcPr>
@@ -2747,12 +2269,6 @@
             </w:tcMar>
           </w:tcPr>
           <w:p>
-            <w:pPr>
-              <w:rPr>
-                <w:sz w:val="40"/>
-                <w:szCs w:val="40"/>
-              </w:rPr>
-            </w:pPr>
             <w:r>
               <w:rPr>
                 <w:rFonts w:ascii="Calibri" w:eastAsia="Calibri" w:hAnsi="Calibri" w:cs="Calibri"/>
@@ -2760,8 +2276,8 @@
                 <w:bCs/>
                 <w:caps/>
                 <w:color w:val="2D5016"/>
-                <w:sz w:val="40"/>
-                <w:szCs w:val="40"/>
+                <w:sz w:val="22"/>
+                <w:szCs w:val="22"/>
               </w:rPr>
               <w:t>Project Experience</w:t>
             </w:r>
@@ -2772,25 +2288,15 @@
     <w:p>
       <w:pPr>
         <w:spacing w:after="80"/>
-        <w:rPr>
-          <w:sz w:val="28"/>
-          <w:szCs w:val="28"/>
-        </w:rPr>
       </w:pPr>
     </w:p>
     <w:p>
-      <w:pPr>
-        <w:rPr>
-          <w:sz w:val="28"/>
-          <w:szCs w:val="28"/>
-        </w:rPr>
-      </w:pPr>
-      <w:r>
-        <w:rPr>
-          <w:rFonts w:ascii="Calibri" w:eastAsia="Calibri" w:hAnsi="Calibri" w:cs="Calibri"/>
-          <w:color w:val="3C3C3C"/>
-          <w:sz w:val="28"/>
-          <w:szCs w:val="28"/>
+      <w:r>
+        <w:rPr>
+          <w:rFonts w:ascii="Calibri" w:eastAsia="Calibri" w:hAnsi="Calibri" w:cs="Calibri"/>
+          <w:color w:val="3C3C3C"/>
+          <w:sz w:val="18"/>
+          <w:szCs w:val="18"/>
         </w:rPr>
         <w:t xml:space="preserve">{% for </w:t>
       </w:r>
@@ -2799,8 +2305,8 @@
         <w:rPr>
           <w:rFonts w:ascii="Calibri" w:eastAsia="Calibri" w:hAnsi="Calibri" w:cs="Calibri"/>
           <w:color w:val="3C3C3C"/>
-          <w:sz w:val="28"/>
-          <w:szCs w:val="28"/>
+          <w:sz w:val="18"/>
+          <w:szCs w:val="18"/>
         </w:rPr>
         <w:t>proj</w:t>
       </w:r>
@@ -2809,8 +2315,8 @@
         <w:rPr>
           <w:rFonts w:ascii="Calibri" w:eastAsia="Calibri" w:hAnsi="Calibri" w:cs="Calibri"/>
           <w:color w:val="3C3C3C"/>
-          <w:sz w:val="28"/>
-          <w:szCs w:val="28"/>
+          <w:sz w:val="18"/>
+          <w:szCs w:val="18"/>
         </w:rPr>
         <w:t xml:space="preserve"> in </w:t>
       </w:r>
@@ -2819,8 +2325,8 @@
         <w:rPr>
           <w:rFonts w:ascii="Calibri" w:eastAsia="Calibri" w:hAnsi="Calibri" w:cs="Calibri"/>
           <w:color w:val="3C3C3C"/>
-          <w:sz w:val="28"/>
-          <w:szCs w:val="28"/>
+          <w:sz w:val="18"/>
+          <w:szCs w:val="18"/>
         </w:rPr>
         <w:t>project_experience</w:t>
       </w:r>
@@ -2829,8 +2335,8 @@
         <w:rPr>
           <w:rFonts w:ascii="Calibri" w:eastAsia="Calibri" w:hAnsi="Calibri" w:cs="Calibri"/>
           <w:color w:val="3C3C3C"/>
-          <w:sz w:val="28"/>
-          <w:szCs w:val="28"/>
+          <w:sz w:val="18"/>
+          <w:szCs w:val="18"/>
         </w:rPr>
         <w:t xml:space="preserve"> %}</w:t>
       </w:r>
@@ -2842,10 +2348,6 @@
         </w:pBdr>
         <w:spacing w:before="120" w:after="20"/>
         <w:ind w:left="160"/>
-        <w:rPr>
-          <w:sz w:val="32"/>
-          <w:szCs w:val="32"/>
-        </w:rPr>
       </w:pPr>
       <w:proofErr w:type="gramStart"/>
       <w:r>
@@ -2854,8 +2356,8 @@
           <w:b/>
           <w:bCs/>
           <w:color w:val="1A1A1A"/>
-          <w:sz w:val="32"/>
-          <w:szCs w:val="32"/>
+          <w:sz w:val="22"/>
+          <w:szCs w:val="22"/>
         </w:rPr>
         <w:t xml:space="preserve">{{ </w:t>
       </w:r>
@@ -2866,8 +2368,8 @@
           <w:b/>
           <w:bCs/>
           <w:color w:val="1A1A1A"/>
-          <w:sz w:val="32"/>
-          <w:szCs w:val="32"/>
+          <w:sz w:val="22"/>
+          <w:szCs w:val="22"/>
         </w:rPr>
         <w:t>proj</w:t>
       </w:r>
@@ -2878,8 +2380,8 @@
           <w:b/>
           <w:bCs/>
           <w:color w:val="1A1A1A"/>
-          <w:sz w:val="32"/>
-          <w:szCs w:val="32"/>
+          <w:sz w:val="22"/>
+          <w:szCs w:val="22"/>
         </w:rPr>
         <w:t>.</w:t>
       </w:r>
@@ -2890,8 +2392,8 @@
           <w:b/>
           <w:bCs/>
           <w:color w:val="1A1A1A"/>
-          <w:sz w:val="32"/>
-          <w:szCs w:val="32"/>
+          <w:sz w:val="22"/>
+          <w:szCs w:val="22"/>
         </w:rPr>
         <w:t>title</w:t>
       </w:r>
@@ -2902,8 +2404,8 @@
           <w:b/>
           <w:bCs/>
           <w:color w:val="1A1A1A"/>
-          <w:sz w:val="32"/>
-          <w:szCs w:val="32"/>
+          <w:sz w:val="22"/>
+          <w:szCs w:val="22"/>
         </w:rPr>
         <w:t xml:space="preserve"> }</w:t>
       </w:r>
@@ -2914,8 +2416,8 @@
           <w:b/>
           <w:bCs/>
           <w:color w:val="1A1A1A"/>
-          <w:sz w:val="32"/>
-          <w:szCs w:val="32"/>
+          <w:sz w:val="22"/>
+          <w:szCs w:val="22"/>
         </w:rPr>
         <w:t>}</w:t>
       </w:r>
@@ -2924,24 +2426,14 @@
       <w:pPr>
         <w:spacing w:after="30"/>
         <w:ind w:left="160"/>
-        <w:rPr>
-          <w:b/>
-          <w:bCs/>
-          <w:sz w:val="32"/>
-          <w:szCs w:val="32"/>
-          <w:u w:val="single"/>
-        </w:rPr>
       </w:pPr>
       <w:proofErr w:type="gramStart"/>
       <w:r>
         <w:rPr>
           <w:rFonts w:ascii="Calibri" w:eastAsia="Calibri" w:hAnsi="Calibri" w:cs="Calibri"/>
-          <w:b/>
-          <w:bCs/>
           <w:color w:val="4A7C2F"/>
-          <w:sz w:val="32"/>
-          <w:szCs w:val="32"/>
-          <w:u w:val="single"/>
+          <w:sz w:val="17"/>
+          <w:szCs w:val="17"/>
         </w:rPr>
         <w:t>{{ proj.url</w:t>
       </w:r>
@@ -2949,12 +2441,9 @@
       <w:r>
         <w:rPr>
           <w:rFonts w:ascii="Calibri" w:eastAsia="Calibri" w:hAnsi="Calibri" w:cs="Calibri"/>
-          <w:b/>
-          <w:bCs/>
           <w:color w:val="4A7C2F"/>
-          <w:sz w:val="32"/>
-          <w:szCs w:val="32"/>
-          <w:u w:val="single"/>
+          <w:sz w:val="17"/>
+          <w:szCs w:val="17"/>
         </w:rPr>
         <w:t xml:space="preserve"> }}</w:t>
       </w:r>
@@ -2964,8 +2453,27 @@
         <w:spacing w:after="60"/>
         <w:ind w:left="160"/>
         <w:rPr>
-          <w:sz w:val="32"/>
-          <w:szCs w:val="32"/>
+          <w:b/>
+          <w:color w:val="196B24" w:themeColor="accent3"/>
+          <w14:glow w14:rad="228600">
+            <w14:schemeClr w14:val="accent6">
+              <w14:alpha w14:val="60000"/>
+              <w14:satMod w14:val="175000"/>
+            </w14:schemeClr>
+          </w14:glow>
+          <w14:textOutline w14:w="0" w14:cap="flat" w14:cmpd="sng" w14:algn="ctr">
+            <w14:noFill/>
+            <w14:prstDash w14:val="solid"/>
+            <w14:round/>
+          </w14:textOutline>
+          <w14:props3d w14:extrusionH="57150" w14:contourW="0" w14:prstMaterial="matte">
+            <w14:bevelT w14:w="63500" w14:h="12700" w14:prst="angle"/>
+            <w14:contourClr>
+              <w14:schemeClr w14:val="bg1">
+                <w14:lumMod w14:val="65000"/>
+              </w14:schemeClr>
+            </w14:contourClr>
+          </w14:props3d>
         </w:rPr>
       </w:pPr>
       <w:proofErr w:type="gramStart"/>
@@ -2974,9 +2482,28 @@
           <w:rFonts w:ascii="Calibri" w:eastAsia="Calibri" w:hAnsi="Calibri" w:cs="Calibri"/>
           <w:b/>
           <w:bCs/>
-          <w:color w:val="2D5016"/>
-          <w:sz w:val="32"/>
-          <w:szCs w:val="32"/>
+          <w:color w:val="196B24" w:themeColor="accent3"/>
+          <w:sz w:val="17"/>
+          <w:szCs w:val="17"/>
+          <w14:glow w14:rad="228600">
+            <w14:schemeClr w14:val="accent6">
+              <w14:alpha w14:val="60000"/>
+              <w14:satMod w14:val="175000"/>
+            </w14:schemeClr>
+          </w14:glow>
+          <w14:textOutline w14:w="0" w14:cap="flat" w14:cmpd="sng" w14:algn="ctr">
+            <w14:noFill/>
+            <w14:prstDash w14:val="solid"/>
+            <w14:round/>
+          </w14:textOutline>
+          <w14:props3d w14:extrusionH="57150" w14:contourW="0" w14:prstMaterial="matte">
+            <w14:bevelT w14:w="63500" w14:h="12700" w14:prst="angle"/>
+            <w14:contourClr>
+              <w14:schemeClr w14:val="bg1">
+                <w14:lumMod w14:val="65000"/>
+              </w14:schemeClr>
+            </w14:contourClr>
+          </w14:props3d>
         </w:rPr>
         <w:t xml:space="preserve">{{ </w:t>
       </w:r>
@@ -2986,9 +2513,28 @@
           <w:rFonts w:ascii="Calibri" w:eastAsia="Calibri" w:hAnsi="Calibri" w:cs="Calibri"/>
           <w:b/>
           <w:bCs/>
-          <w:color w:val="2D5016"/>
-          <w:sz w:val="32"/>
-          <w:szCs w:val="32"/>
+          <w:color w:val="196B24" w:themeColor="accent3"/>
+          <w:sz w:val="17"/>
+          <w:szCs w:val="17"/>
+          <w14:glow w14:rad="228600">
+            <w14:schemeClr w14:val="accent6">
+              <w14:alpha w14:val="60000"/>
+              <w14:satMod w14:val="175000"/>
+            </w14:schemeClr>
+          </w14:glow>
+          <w14:textOutline w14:w="0" w14:cap="flat" w14:cmpd="sng" w14:algn="ctr">
+            <w14:noFill/>
+            <w14:prstDash w14:val="solid"/>
+            <w14:round/>
+          </w14:textOutline>
+          <w14:props3d w14:extrusionH="57150" w14:contourW="0" w14:prstMaterial="matte">
+            <w14:bevelT w14:w="63500" w14:h="12700" w14:prst="angle"/>
+            <w14:contourClr>
+              <w14:schemeClr w14:val="bg1">
+                <w14:lumMod w14:val="65000"/>
+              </w14:schemeClr>
+            </w14:contourClr>
+          </w14:props3d>
         </w:rPr>
         <w:t>proj</w:t>
       </w:r>
@@ -2998,9 +2544,28 @@
           <w:rFonts w:ascii="Calibri" w:eastAsia="Calibri" w:hAnsi="Calibri" w:cs="Calibri"/>
           <w:b/>
           <w:bCs/>
-          <w:color w:val="2D5016"/>
-          <w:sz w:val="32"/>
-          <w:szCs w:val="32"/>
+          <w:color w:val="196B24" w:themeColor="accent3"/>
+          <w:sz w:val="17"/>
+          <w:szCs w:val="17"/>
+          <w14:glow w14:rad="228600">
+            <w14:schemeClr w14:val="accent6">
+              <w14:alpha w14:val="60000"/>
+              <w14:satMod w14:val="175000"/>
+            </w14:schemeClr>
+          </w14:glow>
+          <w14:textOutline w14:w="0" w14:cap="flat" w14:cmpd="sng" w14:algn="ctr">
+            <w14:noFill/>
+            <w14:prstDash w14:val="solid"/>
+            <w14:round/>
+          </w14:textOutline>
+          <w14:props3d w14:extrusionH="57150" w14:contourW="0" w14:prstMaterial="matte">
+            <w14:bevelT w14:w="63500" w14:h="12700" w14:prst="angle"/>
+            <w14:contourClr>
+              <w14:schemeClr w14:val="bg1">
+                <w14:lumMod w14:val="65000"/>
+              </w14:schemeClr>
+            </w14:contourClr>
+          </w14:props3d>
         </w:rPr>
         <w:t>.tech_</w:t>
       </w:r>
@@ -3010,9 +2575,28 @@
           <w:rFonts w:ascii="Calibri" w:eastAsia="Calibri" w:hAnsi="Calibri" w:cs="Calibri"/>
           <w:b/>
           <w:bCs/>
-          <w:color w:val="2D5016"/>
-          <w:sz w:val="32"/>
-          <w:szCs w:val="32"/>
+          <w:color w:val="196B24" w:themeColor="accent3"/>
+          <w:sz w:val="17"/>
+          <w:szCs w:val="17"/>
+          <w14:glow w14:rad="228600">
+            <w14:schemeClr w14:val="accent6">
+              <w14:alpha w14:val="60000"/>
+              <w14:satMod w14:val="175000"/>
+            </w14:schemeClr>
+          </w14:glow>
+          <w14:textOutline w14:w="0" w14:cap="flat" w14:cmpd="sng" w14:algn="ctr">
+            <w14:noFill/>
+            <w14:prstDash w14:val="solid"/>
+            <w14:round/>
+          </w14:textOutline>
+          <w14:props3d w14:extrusionH="57150" w14:contourW="0" w14:prstMaterial="matte">
+            <w14:bevelT w14:w="63500" w14:h="12700" w14:prst="angle"/>
+            <w14:contourClr>
+              <w14:schemeClr w14:val="bg1">
+                <w14:lumMod w14:val="65000"/>
+              </w14:schemeClr>
+            </w14:contourClr>
+          </w14:props3d>
         </w:rPr>
         <w:t>stack</w:t>
       </w:r>
@@ -3022,9 +2606,28 @@
           <w:rFonts w:ascii="Calibri" w:eastAsia="Calibri" w:hAnsi="Calibri" w:cs="Calibri"/>
           <w:b/>
           <w:bCs/>
-          <w:color w:val="2D5016"/>
-          <w:sz w:val="32"/>
-          <w:szCs w:val="32"/>
+          <w:color w:val="196B24" w:themeColor="accent3"/>
+          <w:sz w:val="17"/>
+          <w:szCs w:val="17"/>
+          <w14:glow w14:rad="228600">
+            <w14:schemeClr w14:val="accent6">
+              <w14:alpha w14:val="60000"/>
+              <w14:satMod w14:val="175000"/>
+            </w14:schemeClr>
+          </w14:glow>
+          <w14:textOutline w14:w="0" w14:cap="flat" w14:cmpd="sng" w14:algn="ctr">
+            <w14:noFill/>
+            <w14:prstDash w14:val="solid"/>
+            <w14:round/>
+          </w14:textOutline>
+          <w14:props3d w14:extrusionH="57150" w14:contourW="0" w14:prstMaterial="matte">
+            <w14:bevelT w14:w="63500" w14:h="12700" w14:prst="angle"/>
+            <w14:contourClr>
+              <w14:schemeClr w14:val="bg1">
+                <w14:lumMod w14:val="65000"/>
+              </w14:schemeClr>
+            </w14:contourClr>
+          </w14:props3d>
         </w:rPr>
         <w:t xml:space="preserve"> }</w:t>
       </w:r>
@@ -3034,26 +2637,39 @@
           <w:rFonts w:ascii="Calibri" w:eastAsia="Calibri" w:hAnsi="Calibri" w:cs="Calibri"/>
           <w:b/>
           <w:bCs/>
-          <w:color w:val="2D5016"/>
-          <w:sz w:val="32"/>
-          <w:szCs w:val="32"/>
+          <w:color w:val="196B24" w:themeColor="accent3"/>
+          <w:sz w:val="17"/>
+          <w:szCs w:val="17"/>
+          <w14:glow w14:rad="228600">
+            <w14:schemeClr w14:val="accent6">
+              <w14:alpha w14:val="60000"/>
+              <w14:satMod w14:val="175000"/>
+            </w14:schemeClr>
+          </w14:glow>
+          <w14:textOutline w14:w="0" w14:cap="flat" w14:cmpd="sng" w14:algn="ctr">
+            <w14:noFill/>
+            <w14:prstDash w14:val="solid"/>
+            <w14:round/>
+          </w14:textOutline>
+          <w14:props3d w14:extrusionH="57150" w14:contourW="0" w14:prstMaterial="matte">
+            <w14:bevelT w14:w="63500" w14:h="12700" w14:prst="angle"/>
+            <w14:contourClr>
+              <w14:schemeClr w14:val="bg1">
+                <w14:lumMod w14:val="65000"/>
+              </w14:schemeClr>
+            </w14:contourClr>
+          </w14:props3d>
         </w:rPr>
         <w:t>}</w:t>
       </w:r>
     </w:p>
     <w:p>
-      <w:pPr>
-        <w:rPr>
-          <w:sz w:val="28"/>
-          <w:szCs w:val="28"/>
-        </w:rPr>
-      </w:pPr>
-      <w:r>
-        <w:rPr>
-          <w:rFonts w:ascii="Calibri" w:eastAsia="Calibri" w:hAnsi="Calibri" w:cs="Calibri"/>
-          <w:color w:val="3C3C3C"/>
-          <w:sz w:val="28"/>
-          <w:szCs w:val="28"/>
+      <w:r>
+        <w:rPr>
+          <w:rFonts w:ascii="Calibri" w:eastAsia="Calibri" w:hAnsi="Calibri" w:cs="Calibri"/>
+          <w:color w:val="3C3C3C"/>
+          <w:sz w:val="18"/>
+          <w:szCs w:val="18"/>
         </w:rPr>
         <w:t xml:space="preserve">{% for bullet in </w:t>
       </w:r>
@@ -3063,8 +2679,8 @@
         <w:rPr>
           <w:rFonts w:ascii="Calibri" w:eastAsia="Calibri" w:hAnsi="Calibri" w:cs="Calibri"/>
           <w:color w:val="3C3C3C"/>
-          <w:sz w:val="28"/>
-          <w:szCs w:val="28"/>
+          <w:sz w:val="18"/>
+          <w:szCs w:val="18"/>
         </w:rPr>
         <w:t>proj.bullets</w:t>
       </w:r>
@@ -3074,8 +2690,8 @@
         <w:rPr>
           <w:rFonts w:ascii="Calibri" w:eastAsia="Calibri" w:hAnsi="Calibri" w:cs="Calibri"/>
           <w:color w:val="3C3C3C"/>
-          <w:sz w:val="28"/>
-          <w:szCs w:val="28"/>
+          <w:sz w:val="18"/>
+          <w:szCs w:val="18"/>
         </w:rPr>
         <w:t xml:space="preserve"> %}</w:t>
       </w:r>
@@ -3088,18 +2704,14 @@
           <w:numId w:val="2"/>
         </w:numPr>
         <w:spacing w:before="40" w:after="40"/>
-        <w:rPr>
-          <w:sz w:val="28"/>
-          <w:szCs w:val="28"/>
-        </w:rPr>
       </w:pPr>
       <w:proofErr w:type="gramStart"/>
       <w:r>
         <w:rPr>
           <w:rFonts w:ascii="Calibri" w:eastAsia="Calibri" w:hAnsi="Calibri" w:cs="Calibri"/>
           <w:color w:val="3C3C3C"/>
-          <w:sz w:val="28"/>
-          <w:szCs w:val="28"/>
+          <w:sz w:val="19"/>
+          <w:szCs w:val="19"/>
         </w:rPr>
         <w:t>{{ bullet</w:t>
       </w:r>
@@ -3108,25 +2720,19 @@
         <w:rPr>
           <w:rFonts w:ascii="Calibri" w:eastAsia="Calibri" w:hAnsi="Calibri" w:cs="Calibri"/>
           <w:color w:val="3C3C3C"/>
-          <w:sz w:val="28"/>
-          <w:szCs w:val="28"/>
+          <w:sz w:val="19"/>
+          <w:szCs w:val="19"/>
         </w:rPr>
         <w:t xml:space="preserve"> }}</w:t>
       </w:r>
     </w:p>
     <w:p>
-      <w:pPr>
-        <w:rPr>
-          <w:sz w:val="28"/>
-          <w:szCs w:val="28"/>
-        </w:rPr>
-      </w:pPr>
-      <w:r>
-        <w:rPr>
-          <w:rFonts w:ascii="Calibri" w:eastAsia="Calibri" w:hAnsi="Calibri" w:cs="Calibri"/>
-          <w:color w:val="3C3C3C"/>
-          <w:sz w:val="28"/>
-          <w:szCs w:val="28"/>
+      <w:r>
+        <w:rPr>
+          <w:rFonts w:ascii="Calibri" w:eastAsia="Calibri" w:hAnsi="Calibri" w:cs="Calibri"/>
+          <w:color w:val="3C3C3C"/>
+          <w:sz w:val="18"/>
+          <w:szCs w:val="18"/>
         </w:rPr>
         <w:t xml:space="preserve">{% </w:t>
       </w:r>
@@ -3135,8 +2741,8 @@
         <w:rPr>
           <w:rFonts w:ascii="Calibri" w:eastAsia="Calibri" w:hAnsi="Calibri" w:cs="Calibri"/>
           <w:color w:val="3C3C3C"/>
-          <w:sz w:val="28"/>
-          <w:szCs w:val="28"/>
+          <w:sz w:val="18"/>
+          <w:szCs w:val="18"/>
         </w:rPr>
         <w:t>endfor</w:t>
       </w:r>
@@ -3145,8 +2751,8 @@
         <w:rPr>
           <w:rFonts w:ascii="Calibri" w:eastAsia="Calibri" w:hAnsi="Calibri" w:cs="Calibri"/>
           <w:color w:val="3C3C3C"/>
-          <w:sz w:val="28"/>
-          <w:szCs w:val="28"/>
+          <w:sz w:val="18"/>
+          <w:szCs w:val="18"/>
         </w:rPr>
         <w:t xml:space="preserve"> %}</w:t>
       </w:r>
@@ -3154,25 +2760,15 @@
     <w:p>
       <w:pPr>
         <w:spacing w:after="80"/>
-        <w:rPr>
-          <w:sz w:val="28"/>
-          <w:szCs w:val="28"/>
-        </w:rPr>
       </w:pPr>
     </w:p>
     <w:p>
-      <w:pPr>
-        <w:rPr>
-          <w:sz w:val="28"/>
-          <w:szCs w:val="28"/>
-        </w:rPr>
-      </w:pPr>
-      <w:r>
-        <w:rPr>
-          <w:rFonts w:ascii="Calibri" w:eastAsia="Calibri" w:hAnsi="Calibri" w:cs="Calibri"/>
-          <w:color w:val="3C3C3C"/>
-          <w:sz w:val="28"/>
-          <w:szCs w:val="28"/>
+      <w:r>
+        <w:rPr>
+          <w:rFonts w:ascii="Calibri" w:eastAsia="Calibri" w:hAnsi="Calibri" w:cs="Calibri"/>
+          <w:color w:val="3C3C3C"/>
+          <w:sz w:val="18"/>
+          <w:szCs w:val="18"/>
         </w:rPr>
         <w:t xml:space="preserve">{% </w:t>
       </w:r>
@@ -3181,8 +2777,8 @@
         <w:rPr>
           <w:rFonts w:ascii="Calibri" w:eastAsia="Calibri" w:hAnsi="Calibri" w:cs="Calibri"/>
           <w:color w:val="3C3C3C"/>
-          <w:sz w:val="28"/>
-          <w:szCs w:val="28"/>
+          <w:sz w:val="18"/>
+          <w:szCs w:val="18"/>
         </w:rPr>
         <w:t>endfor</w:t>
       </w:r>
@@ -3191,41 +2787,21 @@
         <w:rPr>
           <w:rFonts w:ascii="Calibri" w:eastAsia="Calibri" w:hAnsi="Calibri" w:cs="Calibri"/>
           <w:color w:val="3C3C3C"/>
-          <w:sz w:val="28"/>
-          <w:szCs w:val="28"/>
+          <w:sz w:val="18"/>
+          <w:szCs w:val="18"/>
         </w:rPr>
         <w:t xml:space="preserve"> %}</w:t>
       </w:r>
     </w:p>
     <w:p>
-      <w:pPr>
-        <w:rPr>
-          <w:sz w:val="28"/>
-          <w:szCs w:val="28"/>
-        </w:rPr>
-        <w:sectPr>
-          <w:pgSz w:w="11906" w:h="16838"/>
-          <w:pgMar w:top="0" w:right="720" w:bottom="720" w:left="720" w:header="708" w:footer="708" w:gutter="0"/>
-          <w:cols w:space="720"/>
-          <w:docGrid w:linePitch="360"/>
-        </w:sectPr>
-      </w:pPr>
-      <w:r>
-        <w:rPr>
-          <w:sz w:val="28"/>
-          <w:szCs w:val="28"/>
-        </w:rPr>
+      <w:r>
         <w:br/>
       </w:r>
-    </w:p>
-    <w:p>
-      <w:pPr>
-        <w:rPr>
-          <w:sz w:val="28"/>
-          <w:szCs w:val="28"/>
-        </w:rPr>
-      </w:pPr>
-    </w:p>
+      <w:r>
+        <w:br w:type="page"/>
+      </w:r>
+    </w:p>
+    <w:p/>
     <w:tbl>
       <w:tblPr>
         <w:tblW w:w="10466" w:type="dxa"/>
@@ -3248,12 +2824,6 @@
         <w:gridCol w:w="10286"/>
       </w:tblGrid>
       <w:tr>
-        <w:tblPrEx>
-          <w:tblCellMar>
-            <w:top w:w="0" w:type="dxa"/>
-            <w:bottom w:w="0" w:type="dxa"/>
-          </w:tblCellMar>
-        </w:tblPrEx>
         <w:tc>
           <w:tcPr>
             <w:tcW w:w="180" w:type="dxa"/>
@@ -3271,14 +2841,7 @@
               <w:right w:w="0" w:type="dxa"/>
             </w:tcMar>
           </w:tcPr>
-          <w:p>
-            <w:pPr>
-              <w:rPr>
-                <w:sz w:val="40"/>
-                <w:szCs w:val="40"/>
-              </w:rPr>
-            </w:pPr>
-          </w:p>
+          <w:p/>
         </w:tc>
         <w:tc>
           <w:tcPr>
@@ -3298,12 +2861,6 @@
             </w:tcMar>
           </w:tcPr>
           <w:p>
-            <w:pPr>
-              <w:rPr>
-                <w:sz w:val="40"/>
-                <w:szCs w:val="40"/>
-              </w:rPr>
-            </w:pPr>
             <w:r>
               <w:rPr>
                 <w:rFonts w:ascii="Calibri" w:eastAsia="Calibri" w:hAnsi="Calibri" w:cs="Calibri"/>
@@ -3311,8 +2868,8 @@
                 <w:bCs/>
                 <w:caps/>
                 <w:color w:val="2D5016"/>
-                <w:sz w:val="40"/>
-                <w:szCs w:val="40"/>
+                <w:sz w:val="22"/>
+                <w:szCs w:val="22"/>
               </w:rPr>
               <w:t>Languages</w:t>
             </w:r>
@@ -3323,25 +2880,15 @@
     <w:p>
       <w:pPr>
         <w:spacing w:after="80"/>
-        <w:rPr>
-          <w:sz w:val="28"/>
-          <w:szCs w:val="28"/>
-        </w:rPr>
       </w:pPr>
     </w:p>
     <w:p>
-      <w:pPr>
-        <w:rPr>
-          <w:sz w:val="28"/>
-          <w:szCs w:val="28"/>
-        </w:rPr>
-      </w:pPr>
-      <w:r>
-        <w:rPr>
-          <w:rFonts w:ascii="Calibri" w:eastAsia="Calibri" w:hAnsi="Calibri" w:cs="Calibri"/>
-          <w:color w:val="3C3C3C"/>
-          <w:sz w:val="28"/>
-          <w:szCs w:val="28"/>
+      <w:r>
+        <w:rPr>
+          <w:rFonts w:ascii="Calibri" w:eastAsia="Calibri" w:hAnsi="Calibri" w:cs="Calibri"/>
+          <w:color w:val="3C3C3C"/>
+          <w:sz w:val="18"/>
+          <w:szCs w:val="18"/>
         </w:rPr>
         <w:t>{% for lang in languages %}</w:t>
       </w:r>
@@ -3349,10 +2896,6 @@
     <w:p>
       <w:pPr>
         <w:spacing w:before="80" w:after="20"/>
-        <w:rPr>
-          <w:sz w:val="28"/>
-          <w:szCs w:val="28"/>
-        </w:rPr>
       </w:pPr>
       <w:proofErr w:type="gramStart"/>
       <w:r>
@@ -3361,8 +2904,6 @@
           <w:b/>
           <w:bCs/>
           <w:color w:val="2D5016"/>
-          <w:sz w:val="32"/>
-          <w:szCs w:val="32"/>
         </w:rPr>
         <w:t>{{ lang.name</w:t>
       </w:r>
@@ -3373,8 +2914,6 @@
           <w:b/>
           <w:bCs/>
           <w:color w:val="2D5016"/>
-          <w:sz w:val="32"/>
-          <w:szCs w:val="32"/>
         </w:rPr>
         <w:t xml:space="preserve"> </w:t>
       </w:r>
@@ -3385,8 +2924,6 @@
           <w:b/>
           <w:bCs/>
           <w:color w:val="2D5016"/>
-          <w:sz w:val="32"/>
-          <w:szCs w:val="32"/>
         </w:rPr>
         <w:t>}}</w:t>
       </w:r>
@@ -3394,8 +2931,6 @@
         <w:rPr>
           <w:rFonts w:ascii="Calibri" w:eastAsia="Calibri" w:hAnsi="Calibri" w:cs="Calibri"/>
           <w:color w:val="3C3C3C"/>
-          <w:sz w:val="32"/>
-          <w:szCs w:val="32"/>
         </w:rPr>
         <w:t xml:space="preserve">   </w:t>
       </w:r>
@@ -3403,8 +2938,8 @@
         <w:rPr>
           <w:rFonts w:ascii="Calibri" w:eastAsia="Calibri" w:hAnsi="Calibri" w:cs="Calibri"/>
           <w:color w:val="7A7A6E"/>
-          <w:sz w:val="28"/>
-          <w:szCs w:val="28"/>
+          <w:sz w:val="17"/>
+          <w:szCs w:val="17"/>
         </w:rPr>
         <w:t xml:space="preserve">{{ </w:t>
       </w:r>
@@ -3413,8 +2948,8 @@
         <w:rPr>
           <w:rFonts w:ascii="Calibri" w:eastAsia="Calibri" w:hAnsi="Calibri" w:cs="Calibri"/>
           <w:color w:val="7A7A6E"/>
-          <w:sz w:val="28"/>
-          <w:szCs w:val="28"/>
+          <w:sz w:val="17"/>
+          <w:szCs w:val="17"/>
         </w:rPr>
         <w:t>lang</w:t>
       </w:r>
@@ -3423,8 +2958,8 @@
         <w:rPr>
           <w:rFonts w:ascii="Calibri" w:eastAsia="Calibri" w:hAnsi="Calibri" w:cs="Calibri"/>
           <w:color w:val="7A7A6E"/>
-          <w:sz w:val="28"/>
-          <w:szCs w:val="28"/>
+          <w:sz w:val="17"/>
+          <w:szCs w:val="17"/>
         </w:rPr>
         <w:t>.level_</w:t>
       </w:r>
@@ -3433,8 +2968,8 @@
         <w:rPr>
           <w:rFonts w:ascii="Calibri" w:eastAsia="Calibri" w:hAnsi="Calibri" w:cs="Calibri"/>
           <w:color w:val="7A7A6E"/>
-          <w:sz w:val="28"/>
-          <w:szCs w:val="28"/>
+          <w:sz w:val="17"/>
+          <w:szCs w:val="17"/>
         </w:rPr>
         <w:t>code</w:t>
       </w:r>
@@ -3443,8 +2978,8 @@
         <w:rPr>
           <w:rFonts w:ascii="Calibri" w:eastAsia="Calibri" w:hAnsi="Calibri" w:cs="Calibri"/>
           <w:color w:val="7A7A6E"/>
-          <w:sz w:val="28"/>
-          <w:szCs w:val="28"/>
+          <w:sz w:val="17"/>
+          <w:szCs w:val="17"/>
         </w:rPr>
         <w:t xml:space="preserve"> }</w:t>
       </w:r>
@@ -3453,8 +2988,8 @@
         <w:rPr>
           <w:rFonts w:ascii="Calibri" w:eastAsia="Calibri" w:hAnsi="Calibri" w:cs="Calibri"/>
           <w:color w:val="7A7A6E"/>
-          <w:sz w:val="28"/>
-          <w:szCs w:val="28"/>
+          <w:sz w:val="17"/>
+          <w:szCs w:val="17"/>
         </w:rPr>
         <w:t>}</w:t>
       </w:r>
@@ -3462,10 +2997,6 @@
     <w:p>
       <w:pPr>
         <w:spacing w:after="10"/>
-        <w:rPr>
-          <w:sz w:val="28"/>
-          <w:szCs w:val="28"/>
-        </w:rPr>
       </w:pPr>
       <w:r>
         <w:rPr>
@@ -3511,10 +3042,6 @@
     <w:p>
       <w:pPr>
         <w:spacing w:after="40"/>
-        <w:rPr>
-          <w:sz w:val="28"/>
-          <w:szCs w:val="28"/>
-        </w:rPr>
       </w:pPr>
       <w:proofErr w:type="gramStart"/>
       <w:r>
@@ -3523,8 +3050,8 @@
           <w:i/>
           <w:iCs/>
           <w:color w:val="7A7A6E"/>
-          <w:sz w:val="28"/>
-          <w:szCs w:val="28"/>
+          <w:sz w:val="16"/>
+          <w:szCs w:val="16"/>
         </w:rPr>
         <w:t xml:space="preserve">{{ </w:t>
       </w:r>
@@ -3535,8 +3062,8 @@
           <w:i/>
           <w:iCs/>
           <w:color w:val="7A7A6E"/>
-          <w:sz w:val="28"/>
-          <w:szCs w:val="28"/>
+          <w:sz w:val="16"/>
+          <w:szCs w:val="16"/>
         </w:rPr>
         <w:t>lang</w:t>
       </w:r>
@@ -3547,8 +3074,8 @@
           <w:i/>
           <w:iCs/>
           <w:color w:val="7A7A6E"/>
-          <w:sz w:val="28"/>
-          <w:szCs w:val="28"/>
+          <w:sz w:val="16"/>
+          <w:szCs w:val="16"/>
         </w:rPr>
         <w:t>.level_</w:t>
       </w:r>
@@ -3559,8 +3086,8 @@
           <w:i/>
           <w:iCs/>
           <w:color w:val="7A7A6E"/>
-          <w:sz w:val="28"/>
-          <w:szCs w:val="28"/>
+          <w:sz w:val="16"/>
+          <w:szCs w:val="16"/>
         </w:rPr>
         <w:t>full</w:t>
       </w:r>
@@ -3571,8 +3098,8 @@
           <w:i/>
           <w:iCs/>
           <w:color w:val="7A7A6E"/>
-          <w:sz w:val="28"/>
-          <w:szCs w:val="28"/>
+          <w:sz w:val="16"/>
+          <w:szCs w:val="16"/>
         </w:rPr>
         <w:t xml:space="preserve"> }</w:t>
       </w:r>
@@ -3583,25 +3110,19 @@
           <w:i/>
           <w:iCs/>
           <w:color w:val="7A7A6E"/>
-          <w:sz w:val="28"/>
-          <w:szCs w:val="28"/>
+          <w:sz w:val="16"/>
+          <w:szCs w:val="16"/>
         </w:rPr>
         <w:t>}</w:t>
       </w:r>
     </w:p>
     <w:p>
-      <w:pPr>
-        <w:rPr>
-          <w:sz w:val="28"/>
-          <w:szCs w:val="28"/>
-        </w:rPr>
-      </w:pPr>
-      <w:r>
-        <w:rPr>
-          <w:rFonts w:ascii="Calibri" w:eastAsia="Calibri" w:hAnsi="Calibri" w:cs="Calibri"/>
-          <w:color w:val="3C3C3C"/>
-          <w:sz w:val="28"/>
-          <w:szCs w:val="28"/>
+      <w:r>
+        <w:rPr>
+          <w:rFonts w:ascii="Calibri" w:eastAsia="Calibri" w:hAnsi="Calibri" w:cs="Calibri"/>
+          <w:color w:val="3C3C3C"/>
+          <w:sz w:val="18"/>
+          <w:szCs w:val="18"/>
         </w:rPr>
         <w:t xml:space="preserve">{% </w:t>
       </w:r>
@@ -3610,8 +3131,8 @@
         <w:rPr>
           <w:rFonts w:ascii="Calibri" w:eastAsia="Calibri" w:hAnsi="Calibri" w:cs="Calibri"/>
           <w:color w:val="3C3C3C"/>
-          <w:sz w:val="28"/>
-          <w:szCs w:val="28"/>
+          <w:sz w:val="18"/>
+          <w:szCs w:val="18"/>
         </w:rPr>
         <w:t>endfor</w:t>
       </w:r>
@@ -3620,24 +3141,14 @@
         <w:rPr>
           <w:rFonts w:ascii="Calibri" w:eastAsia="Calibri" w:hAnsi="Calibri" w:cs="Calibri"/>
           <w:color w:val="3C3C3C"/>
-          <w:sz w:val="28"/>
-          <w:szCs w:val="28"/>
+          <w:sz w:val="18"/>
+          <w:szCs w:val="18"/>
         </w:rPr>
         <w:t xml:space="preserve"> %}</w:t>
       </w:r>
     </w:p>
     <w:p>
-      <w:pPr>
-        <w:rPr>
-          <w:sz w:val="28"/>
-          <w:szCs w:val="28"/>
-        </w:rPr>
-      </w:pPr>
-      <w:r>
-        <w:rPr>
-          <w:sz w:val="28"/>
-          <w:szCs w:val="28"/>
-        </w:rPr>
+      <w:r>
         <w:br/>
       </w:r>
     </w:p>
@@ -3663,12 +3174,6 @@
         <w:gridCol w:w="10286"/>
       </w:tblGrid>
       <w:tr>
-        <w:tblPrEx>
-          <w:tblCellMar>
-            <w:top w:w="0" w:type="dxa"/>
-            <w:bottom w:w="0" w:type="dxa"/>
-          </w:tblCellMar>
-        </w:tblPrEx>
         <w:tc>
           <w:tcPr>
             <w:tcW w:w="180" w:type="dxa"/>
@@ -3686,14 +3191,7 @@
               <w:right w:w="0" w:type="dxa"/>
             </w:tcMar>
           </w:tcPr>
-          <w:p>
-            <w:pPr>
-              <w:rPr>
-                <w:sz w:val="40"/>
-                <w:szCs w:val="40"/>
-              </w:rPr>
-            </w:pPr>
-          </w:p>
+          <w:p/>
         </w:tc>
         <w:tc>
           <w:tcPr>
@@ -3713,12 +3211,6 @@
             </w:tcMar>
           </w:tcPr>
           <w:p>
-            <w:pPr>
-              <w:rPr>
-                <w:sz w:val="40"/>
-                <w:szCs w:val="40"/>
-              </w:rPr>
-            </w:pPr>
             <w:r>
               <w:rPr>
                 <w:rFonts w:ascii="Calibri" w:eastAsia="Calibri" w:hAnsi="Calibri" w:cs="Calibri"/>
@@ -3726,8 +3218,8 @@
                 <w:bCs/>
                 <w:caps/>
                 <w:color w:val="2D5016"/>
-                <w:sz w:val="40"/>
-                <w:szCs w:val="40"/>
+                <w:sz w:val="22"/>
+                <w:szCs w:val="22"/>
               </w:rPr>
               <w:t>Reference</w:t>
             </w:r>
@@ -3738,19 +3230,11 @@
     <w:p>
       <w:pPr>
         <w:spacing w:after="80"/>
-        <w:rPr>
-          <w:sz w:val="40"/>
-          <w:szCs w:val="40"/>
-        </w:rPr>
       </w:pPr>
     </w:p>
     <w:p>
       <w:pPr>
         <w:spacing w:before="80"/>
-        <w:rPr>
-          <w:sz w:val="40"/>
-          <w:szCs w:val="40"/>
-        </w:rPr>
       </w:pPr>
       <w:proofErr w:type="gramStart"/>
       <w:r>
@@ -3759,8 +3243,8 @@
           <w:i/>
           <w:iCs/>
           <w:color w:val="7A7A6E"/>
-          <w:sz w:val="40"/>
-          <w:szCs w:val="40"/>
+          <w:sz w:val="19"/>
+          <w:szCs w:val="19"/>
         </w:rPr>
         <w:t>{{ REFERENCE</w:t>
       </w:r>
@@ -3771,8 +3255,8 @@
           <w:i/>
           <w:iCs/>
           <w:color w:val="7A7A6E"/>
-          <w:sz w:val="40"/>
-          <w:szCs w:val="40"/>
+          <w:sz w:val="19"/>
+          <w:szCs w:val="19"/>
         </w:rPr>
         <w:t xml:space="preserve"> }}</w:t>
       </w:r>
@@ -3790,10 +3274,10 @@
 <file path=word/numbering.xml><?xml version="1.0" encoding="utf-8"?>
 <w:numbering xmlns:wpc="http://schemas.microsoft.com/office/word/2010/wordprocessingCanvas" xmlns:cx="http://schemas.microsoft.com/office/drawing/2014/chartex" xmlns:cx1="http://schemas.microsoft.com/office/drawing/2015/9/8/chartex" xmlns:cx2="http://schemas.microsoft.com/office/drawing/2015/10/21/chartex" xmlns:cx3="http://schemas.microsoft.com/office/drawing/2016/5/9/chartex" xmlns:cx4="http://schemas.microsoft.com/office/drawing/2016/5/10/chartex" xmlns:cx5="http://schemas.microsoft.com/office/drawing/2016/5/11/chartex" xmlns:cx6="http://schemas.microsoft.com/office/drawing/2016/5/12/chartex" xmlns:cx7="http://schemas.microsoft.com/office/drawing/2016/5/13/chartex" xmlns:cx8="http://schemas.microsoft.com/office/drawing/2016/5/14/chartex" xmlns:mc="http://schemas.openxmlformats.org/markup-compatibility/2006" xmlns:aink="http://schemas.microsoft.com/office/drawing/2016/ink" xmlns:am3d="http://schemas.microsoft.com/office/drawing/2017/model3d" xmlns:o="urn:schemas-microsoft-com:office:office" xmlns:oel="http://schemas.microsoft.com/office/2019/extlst" xmlns:r="http://schemas.openxmlformats.org/officeDocument/2006/relationships" xmlns:m="http://schemas.openxmlformats.org/officeDocument/2006/math" xmlns:v="urn:schemas-microsoft-com:vml" xmlns:wp14="http://schemas.microsoft.com/office/word/2010/wordprocessingDrawing" xmlns:wp="http://schemas.openxmlformats.org/drawingml/2006/wordprocessingDrawing" xmlns:w10="urn:schemas-microsoft-com:office:word" xmlns:w="http://schemas.openxmlformats.org/wordprocessingml/2006/main" xmlns:w14="http://schemas.microsoft.com/office/word/2010/wordml" xmlns:w15="http://schemas.microsoft.com/office/word/2012/wordml" xmlns:w16cex="http://schemas.microsoft.com/office/word/2018/wordml/cex" xmlns:w16cid="http://schemas.microsoft.com/office/word/2016/wordml/cid" xmlns:w16="http://schemas.microsoft.com/office/word/2018/wordml" xmlns:w16du="http://schemas.microsoft.com/office/word/2023/wordml/word16du" xmlns:w16sdtdh="http://schemas.microsoft.com/office/word/2020/wordml/sdtdatahash" xmlns:w16sdtfl="http://schemas.microsoft.com/office/word/2024/wordml/sdtformatlock" xmlns:w16se="http://schemas.microsoft.com/office/word/2015/wordml/symex" xmlns:wpg="http://schemas.microsoft.com/office/word/2010/wordprocessingGroup" xmlns:wpi="http://schemas.microsoft.com/office/word/2010/wordprocessingInk" xmlns:wne="http://schemas.microsoft.com/office/word/2006/wordml" xmlns:wps="http://schemas.microsoft.com/office/word/2010/wordprocessingShape" mc:Ignorable="w14 w15 w16se w16cid w16 w16cex w16sdtdh w16sdtfl w16du wp14">
   <w:abstractNum w:abstractNumId="0" w15:restartNumberingAfterBreak="0">
-    <w:nsid w:val="0FF43AD7"/>
+    <w:nsid w:val="0F6E31C5"/>
     <w:multiLevelType w:val="hybridMultilevel"/>
-    <w:tmpl w:val="21901458"/>
-    <w:lvl w:ilvl="0" w:tplc="F43673AE">
+    <w:tmpl w:val="08B6A066"/>
+    <w:lvl w:ilvl="0" w:tplc="D7F2EACE">
       <w:start w:val="1"/>
       <w:numFmt w:val="bullet"/>
       <w:lvlText w:val="→"/>
@@ -3802,52 +3286,52 @@
         <w:ind w:left="440" w:hanging="360"/>
       </w:pPr>
     </w:lvl>
-    <w:lvl w:ilvl="1" w:tplc="495E0C7E">
+    <w:lvl w:ilvl="1" w:tplc="9746FD7A">
       <w:numFmt w:val="decimal"/>
       <w:lvlText w:val=""/>
       <w:lvlJc w:val="left"/>
     </w:lvl>
-    <w:lvl w:ilvl="2" w:tplc="B4081F42">
+    <w:lvl w:ilvl="2" w:tplc="C2E2E9F0">
       <w:numFmt w:val="decimal"/>
       <w:lvlText w:val=""/>
       <w:lvlJc w:val="left"/>
     </w:lvl>
-    <w:lvl w:ilvl="3" w:tplc="67BE647A">
+    <w:lvl w:ilvl="3" w:tplc="415827B6">
       <w:numFmt w:val="decimal"/>
       <w:lvlText w:val=""/>
       <w:lvlJc w:val="left"/>
     </w:lvl>
-    <w:lvl w:ilvl="4" w:tplc="1BD046DE">
+    <w:lvl w:ilvl="4" w:tplc="C5306D30">
       <w:numFmt w:val="decimal"/>
       <w:lvlText w:val=""/>
       <w:lvlJc w:val="left"/>
     </w:lvl>
-    <w:lvl w:ilvl="5" w:tplc="2AFC4C76">
+    <w:lvl w:ilvl="5" w:tplc="5C441CB4">
       <w:numFmt w:val="decimal"/>
       <w:lvlText w:val=""/>
       <w:lvlJc w:val="left"/>
     </w:lvl>
-    <w:lvl w:ilvl="6" w:tplc="BA388172">
+    <w:lvl w:ilvl="6" w:tplc="A1A48782">
       <w:numFmt w:val="decimal"/>
       <w:lvlText w:val=""/>
       <w:lvlJc w:val="left"/>
     </w:lvl>
-    <w:lvl w:ilvl="7" w:tplc="6A42F696">
+    <w:lvl w:ilvl="7" w:tplc="0E3A0D62">
       <w:numFmt w:val="decimal"/>
       <w:lvlText w:val=""/>
       <w:lvlJc w:val="left"/>
     </w:lvl>
-    <w:lvl w:ilvl="8" w:tplc="745453D8">
+    <w:lvl w:ilvl="8" w:tplc="EC80B414">
       <w:numFmt w:val="decimal"/>
       <w:lvlText w:val=""/>
       <w:lvlJc w:val="left"/>
     </w:lvl>
   </w:abstractNum>
   <w:abstractNum w:abstractNumId="1" w15:restartNumberingAfterBreak="0">
-    <w:nsid w:val="64223E62"/>
+    <w:nsid w:val="75B97ED0"/>
     <w:multiLevelType w:val="hybridMultilevel"/>
-    <w:tmpl w:val="FFD67842"/>
-    <w:lvl w:ilvl="0" w:tplc="F5984960">
+    <w:tmpl w:val="AF0E2DD6"/>
+    <w:lvl w:ilvl="0" w:tplc="F3F4A1D8">
       <w:start w:val="1"/>
       <w:numFmt w:val="bullet"/>
       <w:lvlText w:val="●"/>
@@ -3856,7 +3340,7 @@
         <w:ind w:left="720" w:hanging="360"/>
       </w:pPr>
     </w:lvl>
-    <w:lvl w:ilvl="1" w:tplc="60F0614C">
+    <w:lvl w:ilvl="1" w:tplc="4C7ECE4C">
       <w:start w:val="1"/>
       <w:numFmt w:val="bullet"/>
       <w:lvlText w:val="○"/>
@@ -3865,7 +3349,7 @@
         <w:ind w:left="1440" w:hanging="360"/>
       </w:pPr>
     </w:lvl>
-    <w:lvl w:ilvl="2" w:tplc="0DBA119C">
+    <w:lvl w:ilvl="2" w:tplc="ADFC0DC8">
       <w:start w:val="1"/>
       <w:numFmt w:val="bullet"/>
       <w:lvlText w:val="■"/>
@@ -3874,7 +3358,7 @@
         <w:ind w:left="2160" w:hanging="360"/>
       </w:pPr>
     </w:lvl>
-    <w:lvl w:ilvl="3" w:tplc="08AAC6AA">
+    <w:lvl w:ilvl="3" w:tplc="0472E878">
       <w:start w:val="1"/>
       <w:numFmt w:val="bullet"/>
       <w:lvlText w:val="●"/>
@@ -3883,7 +3367,7 @@
         <w:ind w:left="2880" w:hanging="360"/>
       </w:pPr>
     </w:lvl>
-    <w:lvl w:ilvl="4" w:tplc="22D24670">
+    <w:lvl w:ilvl="4" w:tplc="F36AD8FC">
       <w:start w:val="1"/>
       <w:numFmt w:val="bullet"/>
       <w:lvlText w:val="○"/>
@@ -3892,7 +3376,7 @@
         <w:ind w:left="3600" w:hanging="360"/>
       </w:pPr>
     </w:lvl>
-    <w:lvl w:ilvl="5" w:tplc="CCE4C76E">
+    <w:lvl w:ilvl="5" w:tplc="E20CA45A">
       <w:start w:val="1"/>
       <w:numFmt w:val="bullet"/>
       <w:lvlText w:val="■"/>
@@ -3901,7 +3385,7 @@
         <w:ind w:left="4320" w:hanging="360"/>
       </w:pPr>
     </w:lvl>
-    <w:lvl w:ilvl="6" w:tplc="475C1554">
+    <w:lvl w:ilvl="6" w:tplc="8CBA3126">
       <w:start w:val="1"/>
       <w:numFmt w:val="bullet"/>
       <w:lvlText w:val="●"/>
@@ -3910,7 +3394,7 @@
         <w:ind w:left="5040" w:hanging="360"/>
       </w:pPr>
     </w:lvl>
-    <w:lvl w:ilvl="7" w:tplc="B79C7E90">
+    <w:lvl w:ilvl="7" w:tplc="058418E6">
       <w:start w:val="1"/>
       <w:numFmt w:val="bullet"/>
       <w:lvlText w:val="●"/>
@@ -3919,7 +3403,7 @@
         <w:ind w:left="5760" w:hanging="360"/>
       </w:pPr>
     </w:lvl>
-    <w:lvl w:ilvl="8" w:tplc="F15E51D8">
+    <w:lvl w:ilvl="8" w:tplc="6FC8C6FA">
       <w:start w:val="1"/>
       <w:numFmt w:val="bullet"/>
       <w:lvlText w:val="●"/>
@@ -3929,13 +3413,13 @@
       </w:pPr>
     </w:lvl>
   </w:abstractNum>
-  <w:num w:numId="1" w16cid:durableId="1230767370">
+  <w:num w:numId="1" w16cid:durableId="96562459">
     <w:abstractNumId w:val="1"/>
     <w:lvlOverride w:ilvl="0">
       <w:startOverride w:val="1"/>
     </w:lvlOverride>
   </w:num>
-  <w:num w:numId="2" w16cid:durableId="868035046">
+  <w:num w:numId="2" w16cid:durableId="1831285732">
     <w:abstractNumId w:val="0"/>
     <w:lvlOverride w:ilvl="0">
       <w:startOverride w:val="1"/>

</xml_diff>